<commit_message>
Stage 2 done i hope
</commit_message>
<xml_diff>
--- a/tp/Курсач/ПРИ123-ТП-КП#02-НЯМАА.docx
+++ b/tp/Курсач/ПРИ123-ТП-КП#02-НЯМАА.docx
@@ -3959,7 +3959,7 @@
           <w:sz w:val="28"/>
           <w:szCs w:val="32"/>
         </w:rPr>
-        <w:t>Предусловие</w:t>
+        <w:t>Действующее лицо</w:t>
       </w:r>
       <w:r>
         <w:rPr>
@@ -3975,7 +3975,7 @@
           <w:sz w:val="28"/>
           <w:szCs w:val="32"/>
         </w:rPr>
-        <w:t xml:space="preserve"> пользователь должен быть авторизирован под ролью сотрудник или администратор.</w:t>
+        <w:t xml:space="preserve"> сотрудник. </w:t>
       </w:r>
     </w:p>
     <w:p>
@@ -3998,7 +3998,7 @@
           <w:sz w:val="28"/>
           <w:szCs w:val="32"/>
         </w:rPr>
-        <w:t>Действующее лицо</w:t>
+        <w:t>Основной поток</w:t>
       </w:r>
       <w:r>
         <w:rPr>
@@ -4014,7 +4014,48 @@
           <w:sz w:val="28"/>
           <w:szCs w:val="32"/>
         </w:rPr>
-        <w:t xml:space="preserve"> сотрудник. </w:t>
+        <w:t xml:space="preserve"> сотрудник магазина переходит в панель управления веб-приложением, перейдя по специальному </w:t>
+      </w:r>
+      <w:r>
+        <w:rPr>
+          <w:rFonts w:ascii="Times New Roman" w:hAnsi="Times New Roman" w:cs="Times New Roman"/>
+          <w:sz w:val="28"/>
+          <w:szCs w:val="32"/>
+          <w:lang w:val="en-US"/>
+        </w:rPr>
+        <w:t>URL</w:t>
+      </w:r>
+      <w:r>
+        <w:rPr>
+          <w:rFonts w:ascii="Times New Roman" w:hAnsi="Times New Roman" w:cs="Times New Roman"/>
+          <w:sz w:val="28"/>
+          <w:szCs w:val="32"/>
+        </w:rPr>
+        <w:t xml:space="preserve"> </w:t>
+      </w:r>
+      <w:r>
+        <w:rPr>
+          <w:rFonts w:ascii="Times New Roman" w:hAnsi="Times New Roman" w:cs="Times New Roman"/>
+          <w:sz w:val="28"/>
+          <w:szCs w:val="32"/>
+        </w:rPr>
+        <w:t>запросу</w:t>
+      </w:r>
+      <w:r>
+        <w:rPr>
+          <w:rFonts w:ascii="Times New Roman" w:hAnsi="Times New Roman" w:cs="Times New Roman"/>
+          <w:sz w:val="28"/>
+          <w:szCs w:val="32"/>
+        </w:rPr>
+        <w:t xml:space="preserve"> или по кнопке</w:t>
+      </w:r>
+      <w:r>
+        <w:rPr>
+          <w:rFonts w:ascii="Times New Roman" w:hAnsi="Times New Roman" w:cs="Times New Roman"/>
+          <w:sz w:val="28"/>
+          <w:szCs w:val="32"/>
+        </w:rPr>
+        <w:t xml:space="preserve">. </w:t>
       </w:r>
     </w:p>
     <w:p>
@@ -4032,53 +4073,18 @@
       <w:r>
         <w:rPr>
           <w:rFonts w:ascii="Times New Roman" w:hAnsi="Times New Roman" w:cs="Times New Roman"/>
-          <w:i/>
-          <w:iCs/>
-          <w:sz w:val="28"/>
-          <w:szCs w:val="32"/>
-        </w:rPr>
-        <w:t>Основной поток</w:t>
-      </w:r>
-      <w:r>
-        <w:rPr>
-          <w:rFonts w:ascii="Times New Roman" w:hAnsi="Times New Roman" w:cs="Times New Roman"/>
-          <w:sz w:val="28"/>
-          <w:szCs w:val="32"/>
-        </w:rPr>
-        <w:t>:</w:t>
-      </w:r>
-      <w:r>
-        <w:rPr>
-          <w:rFonts w:ascii="Times New Roman" w:hAnsi="Times New Roman" w:cs="Times New Roman"/>
-          <w:sz w:val="28"/>
-          <w:szCs w:val="32"/>
-        </w:rPr>
-        <w:t xml:space="preserve"> сотрудник магазина переходит в панель управления веб-приложением, перейдя по специальному </w:t>
-      </w:r>
-      <w:r>
-        <w:rPr>
-          <w:rFonts w:ascii="Times New Roman" w:hAnsi="Times New Roman" w:cs="Times New Roman"/>
-          <w:sz w:val="28"/>
-          <w:szCs w:val="32"/>
-          <w:lang w:val="en-US"/>
-        </w:rPr>
-        <w:t>URL</w:t>
-      </w:r>
-      <w:r>
-        <w:rPr>
-          <w:rFonts w:ascii="Times New Roman" w:hAnsi="Times New Roman" w:cs="Times New Roman"/>
-          <w:sz w:val="28"/>
-          <w:szCs w:val="32"/>
-        </w:rPr>
-        <w:t xml:space="preserve"> </w:t>
-      </w:r>
-      <w:r>
-        <w:rPr>
-          <w:rFonts w:ascii="Times New Roman" w:hAnsi="Times New Roman" w:cs="Times New Roman"/>
-          <w:sz w:val="28"/>
-          <w:szCs w:val="32"/>
-        </w:rPr>
-        <w:t xml:space="preserve">запросу. </w:t>
+          <w:sz w:val="28"/>
+          <w:szCs w:val="32"/>
+        </w:rPr>
+        <w:t xml:space="preserve">В панели управления </w:t>
+      </w:r>
+      <w:r>
+        <w:rPr>
+          <w:rFonts w:ascii="Times New Roman" w:hAnsi="Times New Roman" w:cs="Times New Roman"/>
+          <w:sz w:val="28"/>
+          <w:szCs w:val="32"/>
+        </w:rPr>
+        <w:t>выбирает пункт «Управление товарами», тем самым попадая на страницу со списком всех товаров и доступных действиях с ними. Сотрудник нажимаем на кнопку «Добавить товар», после чего перенаправляется на страницу добавления продукта, где ему необходимо ввести всю информацию и прикрепить изображения. После сотруднику необходимо нажать на кнопку «Добавить», что добавит данный товар в систему.</w:t>
       </w:r>
     </w:p>
     <w:p>
@@ -4089,25 +4095,246 @@
         <w:jc w:val="both"/>
         <w:rPr>
           <w:rFonts w:ascii="Times New Roman" w:hAnsi="Times New Roman" w:cs="Times New Roman"/>
-          <w:sz w:val="28"/>
-          <w:szCs w:val="32"/>
-        </w:rPr>
-      </w:pPr>
-      <w:r>
-        <w:rPr>
-          <w:rFonts w:ascii="Times New Roman" w:hAnsi="Times New Roman" w:cs="Times New Roman"/>
-          <w:sz w:val="28"/>
-          <w:szCs w:val="32"/>
-        </w:rPr>
-        <w:t xml:space="preserve">В панели управления </w:t>
-      </w:r>
-      <w:r>
-        <w:rPr>
-          <w:rFonts w:ascii="Times New Roman" w:hAnsi="Times New Roman" w:cs="Times New Roman"/>
-          <w:sz w:val="28"/>
-          <w:szCs w:val="32"/>
-        </w:rPr>
-        <w:t>в боковом меню выбирает пункт «Управление товарами», тем самым попадая на страницу со списком всех товаров и доступных действиях с ними. Сотрудник нажимаем на кнопку «Добавить товар», после чего перенаправляется на страницу добавления продукта, где ему необходимо ввести всю информацию и прикрепить изображения. После сотруднику необходимо нажать на кнопку «Добавить», что добавит данный товар в систему.</w:t>
+          <w:i/>
+          <w:iCs/>
+          <w:sz w:val="28"/>
+          <w:szCs w:val="32"/>
+        </w:rPr>
+      </w:pPr>
+      <w:r>
+        <w:rPr>
+          <w:rFonts w:ascii="Times New Roman" w:hAnsi="Times New Roman" w:cs="Times New Roman"/>
+          <w:i/>
+          <w:iCs/>
+          <w:sz w:val="28"/>
+          <w:szCs w:val="32"/>
+        </w:rPr>
+        <w:t>Альтернативный поток</w:t>
+      </w:r>
+      <w:r>
+        <w:rPr>
+          <w:rFonts w:ascii="Times New Roman" w:hAnsi="Times New Roman" w:cs="Times New Roman"/>
+          <w:sz w:val="28"/>
+          <w:szCs w:val="32"/>
+        </w:rPr>
+        <w:t>:</w:t>
+      </w:r>
+      <w:r>
+        <w:rPr>
+          <w:rFonts w:ascii="Times New Roman" w:hAnsi="Times New Roman" w:cs="Times New Roman"/>
+          <w:sz w:val="28"/>
+          <w:szCs w:val="32"/>
+        </w:rPr>
+        <w:t xml:space="preserve"> на этапе ввода всей необходимой информации и прикрепления изображений, сотрудник может </w:t>
+      </w:r>
+      <w:r>
+        <w:rPr>
+          <w:rFonts w:ascii="Times New Roman" w:hAnsi="Times New Roman" w:cs="Times New Roman"/>
+          <w:sz w:val="28"/>
+          <w:szCs w:val="32"/>
+        </w:rPr>
+        <w:t>указать</w:t>
+      </w:r>
+      <w:r>
+        <w:rPr>
+          <w:rFonts w:ascii="Times New Roman" w:hAnsi="Times New Roman" w:cs="Times New Roman"/>
+          <w:sz w:val="28"/>
+          <w:szCs w:val="32"/>
+        </w:rPr>
+        <w:t xml:space="preserve"> </w:t>
+      </w:r>
+      <w:r>
+        <w:rPr>
+          <w:rFonts w:ascii="Times New Roman" w:hAnsi="Times New Roman" w:cs="Times New Roman"/>
+          <w:sz w:val="28"/>
+          <w:szCs w:val="32"/>
+        </w:rPr>
+        <w:t>некорректные</w:t>
+      </w:r>
+      <w:r>
+        <w:rPr>
+          <w:rFonts w:ascii="Times New Roman" w:hAnsi="Times New Roman" w:cs="Times New Roman"/>
+          <w:sz w:val="28"/>
+          <w:szCs w:val="32"/>
+        </w:rPr>
+        <w:t xml:space="preserve"> данные. </w:t>
+      </w:r>
+      <w:r>
+        <w:rPr>
+          <w:rFonts w:ascii="Times New Roman" w:hAnsi="Times New Roman" w:cs="Times New Roman"/>
+          <w:sz w:val="28"/>
+          <w:szCs w:val="32"/>
+        </w:rPr>
+        <w:t>В этом случае</w:t>
+      </w:r>
+      <w:r>
+        <w:rPr>
+          <w:rFonts w:ascii="Times New Roman" w:hAnsi="Times New Roman" w:cs="Times New Roman"/>
+          <w:sz w:val="28"/>
+          <w:szCs w:val="32"/>
+        </w:rPr>
+        <w:t xml:space="preserve"> при нажатии на кнопку «Добавить» новый товар не про</w:t>
+      </w:r>
+      <w:r>
+        <w:rPr>
+          <w:rFonts w:ascii="Times New Roman" w:hAnsi="Times New Roman" w:cs="Times New Roman"/>
+          <w:sz w:val="28"/>
+          <w:szCs w:val="32"/>
+        </w:rPr>
+        <w:t>ходит</w:t>
+      </w:r>
+      <w:r>
+        <w:rPr>
+          <w:rFonts w:ascii="Times New Roman" w:hAnsi="Times New Roman" w:cs="Times New Roman"/>
+          <w:sz w:val="28"/>
+          <w:szCs w:val="32"/>
+        </w:rPr>
+        <w:t xml:space="preserve"> валидацию</w:t>
+      </w:r>
+      <w:r>
+        <w:rPr>
+          <w:rFonts w:ascii="Times New Roman" w:hAnsi="Times New Roman" w:cs="Times New Roman"/>
+          <w:sz w:val="28"/>
+          <w:szCs w:val="32"/>
+        </w:rPr>
+        <w:t>,</w:t>
+      </w:r>
+      <w:r>
+        <w:rPr>
+          <w:rFonts w:ascii="Times New Roman" w:hAnsi="Times New Roman" w:cs="Times New Roman"/>
+          <w:sz w:val="28"/>
+          <w:szCs w:val="32"/>
+        </w:rPr>
+        <w:t xml:space="preserve"> и </w:t>
+      </w:r>
+      <w:r>
+        <w:rPr>
+          <w:rFonts w:ascii="Times New Roman" w:hAnsi="Times New Roman" w:cs="Times New Roman"/>
+          <w:sz w:val="28"/>
+          <w:szCs w:val="32"/>
+        </w:rPr>
+        <w:t>отображается</w:t>
+      </w:r>
+      <w:r>
+        <w:rPr>
+          <w:rFonts w:ascii="Times New Roman" w:hAnsi="Times New Roman" w:cs="Times New Roman"/>
+          <w:sz w:val="28"/>
+          <w:szCs w:val="32"/>
+        </w:rPr>
+        <w:t xml:space="preserve"> </w:t>
+      </w:r>
+      <w:r>
+        <w:rPr>
+          <w:rFonts w:ascii="Times New Roman" w:hAnsi="Times New Roman" w:cs="Times New Roman"/>
+          <w:sz w:val="28"/>
+          <w:szCs w:val="32"/>
+        </w:rPr>
+        <w:t>окно</w:t>
+      </w:r>
+      <w:r>
+        <w:rPr>
+          <w:rFonts w:ascii="Times New Roman" w:hAnsi="Times New Roman" w:cs="Times New Roman"/>
+          <w:sz w:val="28"/>
+          <w:szCs w:val="32"/>
+        </w:rPr>
+        <w:t xml:space="preserve"> </w:t>
+      </w:r>
+      <w:r>
+        <w:rPr>
+          <w:rFonts w:ascii="Times New Roman" w:hAnsi="Times New Roman" w:cs="Times New Roman"/>
+          <w:sz w:val="28"/>
+          <w:szCs w:val="32"/>
+        </w:rPr>
+        <w:t>с перечнем</w:t>
+      </w:r>
+      <w:r>
+        <w:rPr>
+          <w:rFonts w:ascii="Times New Roman" w:hAnsi="Times New Roman" w:cs="Times New Roman"/>
+          <w:sz w:val="28"/>
+          <w:szCs w:val="32"/>
+        </w:rPr>
+        <w:t xml:space="preserve"> ошиб</w:t>
+      </w:r>
+      <w:r>
+        <w:rPr>
+          <w:rFonts w:ascii="Times New Roman" w:hAnsi="Times New Roman" w:cs="Times New Roman"/>
+          <w:sz w:val="28"/>
+          <w:szCs w:val="32"/>
+        </w:rPr>
+        <w:t>ок</w:t>
+      </w:r>
+      <w:r>
+        <w:rPr>
+          <w:rFonts w:ascii="Times New Roman" w:hAnsi="Times New Roman" w:cs="Times New Roman"/>
+          <w:sz w:val="28"/>
+          <w:szCs w:val="32"/>
+        </w:rPr>
+        <w:t xml:space="preserve">. Тогда сотрудник </w:t>
+      </w:r>
+      <w:r>
+        <w:rPr>
+          <w:rFonts w:ascii="Times New Roman" w:hAnsi="Times New Roman" w:cs="Times New Roman"/>
+          <w:sz w:val="28"/>
+          <w:szCs w:val="32"/>
+        </w:rPr>
+        <w:t>нажимает</w:t>
+      </w:r>
+      <w:r>
+        <w:rPr>
+          <w:rFonts w:ascii="Times New Roman" w:hAnsi="Times New Roman" w:cs="Times New Roman"/>
+          <w:sz w:val="28"/>
+          <w:szCs w:val="32"/>
+        </w:rPr>
+        <w:t xml:space="preserve"> </w:t>
+      </w:r>
+      <w:r>
+        <w:rPr>
+          <w:rFonts w:ascii="Times New Roman" w:hAnsi="Times New Roman" w:cs="Times New Roman"/>
+          <w:sz w:val="28"/>
+          <w:szCs w:val="32"/>
+        </w:rPr>
+        <w:lastRenderedPageBreak/>
+        <w:t>кнопку «Изменить»</w:t>
+      </w:r>
+      <w:r>
+        <w:rPr>
+          <w:rFonts w:ascii="Times New Roman" w:hAnsi="Times New Roman" w:cs="Times New Roman"/>
+          <w:sz w:val="28"/>
+          <w:szCs w:val="32"/>
+        </w:rPr>
+        <w:t xml:space="preserve">, окно </w:t>
+      </w:r>
+      <w:r>
+        <w:rPr>
+          <w:rFonts w:ascii="Times New Roman" w:hAnsi="Times New Roman" w:cs="Times New Roman"/>
+          <w:sz w:val="28"/>
+          <w:szCs w:val="32"/>
+        </w:rPr>
+        <w:t>с ошибками закр</w:t>
+      </w:r>
+      <w:r>
+        <w:rPr>
+          <w:rFonts w:ascii="Times New Roman" w:hAnsi="Times New Roman" w:cs="Times New Roman"/>
+          <w:sz w:val="28"/>
+          <w:szCs w:val="32"/>
+        </w:rPr>
+        <w:t xml:space="preserve">ывается, и система возвращает его на страницу ввода данных, где необходимо </w:t>
+      </w:r>
+      <w:r>
+        <w:rPr>
+          <w:rFonts w:ascii="Times New Roman" w:hAnsi="Times New Roman" w:cs="Times New Roman"/>
+          <w:sz w:val="28"/>
+          <w:szCs w:val="32"/>
+        </w:rPr>
+        <w:t>внести</w:t>
+      </w:r>
+      <w:r>
+        <w:rPr>
+          <w:rFonts w:ascii="Times New Roman" w:hAnsi="Times New Roman" w:cs="Times New Roman"/>
+          <w:sz w:val="28"/>
+          <w:szCs w:val="32"/>
+        </w:rPr>
+        <w:t xml:space="preserve"> корректировки.</w:t>
       </w:r>
     </w:p>
     <w:p>
@@ -4132,7 +4359,7 @@
           <w:sz w:val="28"/>
           <w:szCs w:val="32"/>
         </w:rPr>
-        <w:t>Альтернативный поток</w:t>
+        <w:t>Постусловие</w:t>
       </w:r>
       <w:r>
         <w:rPr>
@@ -4148,22 +4375,6 @@
           <w:sz w:val="28"/>
           <w:szCs w:val="32"/>
         </w:rPr>
-        <w:t xml:space="preserve"> на этапе ввода всей необходимой информации и прикрепления изображений, сотрудник может </w:t>
-      </w:r>
-      <w:r>
-        <w:rPr>
-          <w:rFonts w:ascii="Times New Roman" w:hAnsi="Times New Roman" w:cs="Times New Roman"/>
-          <w:sz w:val="28"/>
-          <w:szCs w:val="32"/>
-        </w:rPr>
-        <w:t>указать</w:t>
-      </w:r>
-      <w:r>
-        <w:rPr>
-          <w:rFonts w:ascii="Times New Roman" w:hAnsi="Times New Roman" w:cs="Times New Roman"/>
-          <w:sz w:val="28"/>
-          <w:szCs w:val="32"/>
-        </w:rPr>
         <w:t xml:space="preserve"> </w:t>
       </w:r>
       <w:r>
@@ -4172,176 +4383,7 @@
           <w:sz w:val="28"/>
           <w:szCs w:val="32"/>
         </w:rPr>
-        <w:t>некорректные</w:t>
-      </w:r>
-      <w:r>
-        <w:rPr>
-          <w:rFonts w:ascii="Times New Roman" w:hAnsi="Times New Roman" w:cs="Times New Roman"/>
-          <w:sz w:val="28"/>
-          <w:szCs w:val="32"/>
-        </w:rPr>
-        <w:t xml:space="preserve"> данные. </w:t>
-      </w:r>
-      <w:r>
-        <w:rPr>
-          <w:rFonts w:ascii="Times New Roman" w:hAnsi="Times New Roman" w:cs="Times New Roman"/>
-          <w:sz w:val="28"/>
-          <w:szCs w:val="32"/>
-        </w:rPr>
-        <w:t>В этом случае</w:t>
-      </w:r>
-      <w:r>
-        <w:rPr>
-          <w:rFonts w:ascii="Times New Roman" w:hAnsi="Times New Roman" w:cs="Times New Roman"/>
-          <w:sz w:val="28"/>
-          <w:szCs w:val="32"/>
-        </w:rPr>
-        <w:t xml:space="preserve"> при нажатии на кнопку «Добавить» новый товар не про</w:t>
-      </w:r>
-      <w:r>
-        <w:rPr>
-          <w:rFonts w:ascii="Times New Roman" w:hAnsi="Times New Roman" w:cs="Times New Roman"/>
-          <w:sz w:val="28"/>
-          <w:szCs w:val="32"/>
-        </w:rPr>
-        <w:t>ходит</w:t>
-      </w:r>
-      <w:r>
-        <w:rPr>
-          <w:rFonts w:ascii="Times New Roman" w:hAnsi="Times New Roman" w:cs="Times New Roman"/>
-          <w:sz w:val="28"/>
-          <w:szCs w:val="32"/>
-        </w:rPr>
-        <w:t xml:space="preserve"> </w:t>
-      </w:r>
-      <w:r>
-        <w:rPr>
-          <w:rFonts w:ascii="Times New Roman" w:hAnsi="Times New Roman" w:cs="Times New Roman"/>
-          <w:sz w:val="28"/>
-          <w:szCs w:val="32"/>
-        </w:rPr>
-        <w:lastRenderedPageBreak/>
-        <w:t>валидацию</w:t>
-      </w:r>
-      <w:r>
-        <w:rPr>
-          <w:rFonts w:ascii="Times New Roman" w:hAnsi="Times New Roman" w:cs="Times New Roman"/>
-          <w:sz w:val="28"/>
-          <w:szCs w:val="32"/>
-        </w:rPr>
-        <w:t>,</w:t>
-      </w:r>
-      <w:r>
-        <w:rPr>
-          <w:rFonts w:ascii="Times New Roman" w:hAnsi="Times New Roman" w:cs="Times New Roman"/>
-          <w:sz w:val="28"/>
-          <w:szCs w:val="32"/>
-        </w:rPr>
-        <w:t xml:space="preserve"> и </w:t>
-      </w:r>
-      <w:r>
-        <w:rPr>
-          <w:rFonts w:ascii="Times New Roman" w:hAnsi="Times New Roman" w:cs="Times New Roman"/>
-          <w:sz w:val="28"/>
-          <w:szCs w:val="32"/>
-        </w:rPr>
-        <w:t>отображается</w:t>
-      </w:r>
-      <w:r>
-        <w:rPr>
-          <w:rFonts w:ascii="Times New Roman" w:hAnsi="Times New Roman" w:cs="Times New Roman"/>
-          <w:sz w:val="28"/>
-          <w:szCs w:val="32"/>
-        </w:rPr>
-        <w:t xml:space="preserve"> </w:t>
-      </w:r>
-      <w:r>
-        <w:rPr>
-          <w:rFonts w:ascii="Times New Roman" w:hAnsi="Times New Roman" w:cs="Times New Roman"/>
-          <w:sz w:val="28"/>
-          <w:szCs w:val="32"/>
-        </w:rPr>
-        <w:t>окно</w:t>
-      </w:r>
-      <w:r>
-        <w:rPr>
-          <w:rFonts w:ascii="Times New Roman" w:hAnsi="Times New Roman" w:cs="Times New Roman"/>
-          <w:sz w:val="28"/>
-          <w:szCs w:val="32"/>
-        </w:rPr>
-        <w:t xml:space="preserve"> </w:t>
-      </w:r>
-      <w:r>
-        <w:rPr>
-          <w:rFonts w:ascii="Times New Roman" w:hAnsi="Times New Roman" w:cs="Times New Roman"/>
-          <w:sz w:val="28"/>
-          <w:szCs w:val="32"/>
-        </w:rPr>
-        <w:t>с перечнем</w:t>
-      </w:r>
-      <w:r>
-        <w:rPr>
-          <w:rFonts w:ascii="Times New Roman" w:hAnsi="Times New Roman" w:cs="Times New Roman"/>
-          <w:sz w:val="28"/>
-          <w:szCs w:val="32"/>
-        </w:rPr>
-        <w:t xml:space="preserve"> ошиб</w:t>
-      </w:r>
-      <w:r>
-        <w:rPr>
-          <w:rFonts w:ascii="Times New Roman" w:hAnsi="Times New Roman" w:cs="Times New Roman"/>
-          <w:sz w:val="28"/>
-          <w:szCs w:val="32"/>
-        </w:rPr>
-        <w:t>ок</w:t>
-      </w:r>
-      <w:r>
-        <w:rPr>
-          <w:rFonts w:ascii="Times New Roman" w:hAnsi="Times New Roman" w:cs="Times New Roman"/>
-          <w:sz w:val="28"/>
-          <w:szCs w:val="32"/>
-        </w:rPr>
-        <w:t xml:space="preserve">. Тогда сотрудник </w:t>
-      </w:r>
-      <w:r>
-        <w:rPr>
-          <w:rFonts w:ascii="Times New Roman" w:hAnsi="Times New Roman" w:cs="Times New Roman"/>
-          <w:sz w:val="28"/>
-          <w:szCs w:val="32"/>
-        </w:rPr>
-        <w:t>нажимает</w:t>
-      </w:r>
-      <w:r>
-        <w:rPr>
-          <w:rFonts w:ascii="Times New Roman" w:hAnsi="Times New Roman" w:cs="Times New Roman"/>
-          <w:sz w:val="28"/>
-          <w:szCs w:val="32"/>
-        </w:rPr>
-        <w:t xml:space="preserve"> кнопку «Изменить»</w:t>
-      </w:r>
-      <w:r>
-        <w:rPr>
-          <w:rFonts w:ascii="Times New Roman" w:hAnsi="Times New Roman" w:cs="Times New Roman"/>
-          <w:sz w:val="28"/>
-          <w:szCs w:val="32"/>
-        </w:rPr>
-        <w:t xml:space="preserve">, окно </w:t>
-      </w:r>
-      <w:r>
-        <w:rPr>
-          <w:rFonts w:ascii="Times New Roman" w:hAnsi="Times New Roman" w:cs="Times New Roman"/>
-          <w:sz w:val="28"/>
-          <w:szCs w:val="32"/>
-        </w:rPr>
-        <w:t>с ошибками закр</w:t>
-      </w:r>
-      <w:r>
-        <w:rPr>
-          <w:rFonts w:ascii="Times New Roman" w:hAnsi="Times New Roman" w:cs="Times New Roman"/>
-          <w:sz w:val="28"/>
-          <w:szCs w:val="32"/>
-        </w:rPr>
-        <w:t>ывается, и система возвращает его на страницу ввода данных, где необходимо ввести корректировки.</w:t>
+        <w:t>добавление созданного товара в систему, его отображение в каталоге всех товаров.</w:t>
       </w:r>
     </w:p>
     <w:p>
@@ -4352,33 +4394,78 @@
         <w:jc w:val="both"/>
         <w:rPr>
           <w:rFonts w:ascii="Times New Roman" w:hAnsi="Times New Roman" w:cs="Times New Roman"/>
-          <w:i/>
-          <w:iCs/>
-          <w:sz w:val="28"/>
-          <w:szCs w:val="32"/>
-        </w:rPr>
-      </w:pPr>
-      <w:r>
-        <w:rPr>
-          <w:rFonts w:ascii="Times New Roman" w:hAnsi="Times New Roman" w:cs="Times New Roman"/>
-          <w:i/>
-          <w:iCs/>
-          <w:sz w:val="28"/>
-          <w:szCs w:val="32"/>
-        </w:rPr>
-        <w:t>Постусловие</w:t>
-      </w:r>
-      <w:r>
-        <w:rPr>
-          <w:rFonts w:ascii="Times New Roman" w:hAnsi="Times New Roman" w:cs="Times New Roman"/>
-          <w:sz w:val="28"/>
-          <w:szCs w:val="32"/>
-        </w:rPr>
-        <w:t>:</w:t>
-      </w:r>
-      <w:r>
-        <w:rPr>
-          <w:rFonts w:ascii="Times New Roman" w:hAnsi="Times New Roman" w:cs="Times New Roman"/>
+          <w:b/>
+          <w:bCs/>
+          <w:sz w:val="28"/>
+          <w:szCs w:val="32"/>
+        </w:rPr>
+      </w:pPr>
+      <w:r>
+        <w:rPr>
+          <w:rFonts w:ascii="Times New Roman" w:hAnsi="Times New Roman" w:cs="Times New Roman"/>
+          <w:b/>
+          <w:bCs/>
+          <w:sz w:val="28"/>
+          <w:szCs w:val="32"/>
+        </w:rPr>
+        <w:t>Прецедент</w:t>
+      </w:r>
+      <w:r>
+        <w:rPr>
+          <w:rFonts w:ascii="Times New Roman" w:hAnsi="Times New Roman" w:cs="Times New Roman"/>
+          <w:b/>
+          <w:bCs/>
+          <w:sz w:val="28"/>
+          <w:szCs w:val="32"/>
+        </w:rPr>
+        <w:t xml:space="preserve"> 2:</w:t>
+      </w:r>
+      <w:r>
+        <w:rPr>
+          <w:rFonts w:ascii="Times New Roman" w:hAnsi="Times New Roman" w:cs="Times New Roman"/>
+          <w:b/>
+          <w:bCs/>
+          <w:sz w:val="28"/>
+          <w:szCs w:val="32"/>
+        </w:rPr>
+        <w:t xml:space="preserve"> «</w:t>
+      </w:r>
+      <w:r>
+        <w:rPr>
+          <w:rFonts w:ascii="Times New Roman" w:hAnsi="Times New Roman" w:cs="Times New Roman"/>
+          <w:b/>
+          <w:bCs/>
+          <w:sz w:val="28"/>
+          <w:szCs w:val="32"/>
+        </w:rPr>
+        <w:t>Изменить роль пользователя</w:t>
+      </w:r>
+      <w:r>
+        <w:rPr>
+          <w:rFonts w:ascii="Times New Roman" w:hAnsi="Times New Roman" w:cs="Times New Roman"/>
+          <w:b/>
+          <w:bCs/>
+          <w:sz w:val="28"/>
+          <w:szCs w:val="32"/>
+        </w:rPr>
+        <w:t>» («</w:t>
+      </w:r>
+      <w:r>
+        <w:rPr>
+          <w:rFonts w:ascii="Times New Roman" w:hAnsi="Times New Roman" w:cs="Times New Roman"/>
+          <w:b/>
+          <w:bCs/>
+          <w:sz w:val="28"/>
+          <w:szCs w:val="32"/>
+          <w:lang w:val="en-US"/>
+        </w:rPr>
+        <w:t>Change</w:t>
+      </w:r>
+      <w:r>
+        <w:rPr>
+          <w:rFonts w:ascii="Times New Roman" w:hAnsi="Times New Roman" w:cs="Times New Roman"/>
+          <w:b/>
+          <w:bCs/>
           <w:sz w:val="28"/>
           <w:szCs w:val="32"/>
         </w:rPr>
@@ -4387,10 +4474,44 @@
       <w:r>
         <w:rPr>
           <w:rFonts w:ascii="Times New Roman" w:hAnsi="Times New Roman" w:cs="Times New Roman"/>
-          <w:sz w:val="28"/>
-          <w:szCs w:val="32"/>
-        </w:rPr>
-        <w:t>добавление созданного товара в систему, его отображение в каталоге всех товаров.</w:t>
+          <w:b/>
+          <w:bCs/>
+          <w:sz w:val="28"/>
+          <w:szCs w:val="32"/>
+          <w:lang w:val="en-US"/>
+        </w:rPr>
+        <w:t>user</w:t>
+      </w:r>
+      <w:r>
+        <w:rPr>
+          <w:rFonts w:ascii="Times New Roman" w:hAnsi="Times New Roman" w:cs="Times New Roman"/>
+          <w:b/>
+          <w:bCs/>
+          <w:sz w:val="28"/>
+          <w:szCs w:val="32"/>
+        </w:rPr>
+        <w:t xml:space="preserve"> </w:t>
+      </w:r>
+      <w:r>
+        <w:rPr>
+          <w:rFonts w:ascii="Times New Roman" w:hAnsi="Times New Roman" w:cs="Times New Roman"/>
+          <w:b/>
+          <w:bCs/>
+          <w:sz w:val="28"/>
+          <w:szCs w:val="32"/>
+          <w:lang w:val="en-US"/>
+        </w:rPr>
+        <w:t>role</w:t>
+      </w:r>
+      <w:r>
+        <w:rPr>
+          <w:rFonts w:ascii="Times New Roman" w:hAnsi="Times New Roman" w:cs="Times New Roman"/>
+          <w:b/>
+          <w:bCs/>
+          <w:sz w:val="28"/>
+          <w:szCs w:val="32"/>
+        </w:rPr>
+        <w:t>»).</w:t>
       </w:r>
     </w:p>
     <w:p>
@@ -4401,124 +4522,37 @@
         <w:jc w:val="both"/>
         <w:rPr>
           <w:rFonts w:ascii="Times New Roman" w:hAnsi="Times New Roman" w:cs="Times New Roman"/>
-          <w:b/>
-          <w:bCs/>
-          <w:sz w:val="28"/>
-          <w:szCs w:val="32"/>
-        </w:rPr>
-      </w:pPr>
-      <w:r>
-        <w:rPr>
-          <w:rFonts w:ascii="Times New Roman" w:hAnsi="Times New Roman" w:cs="Times New Roman"/>
-          <w:b/>
-          <w:bCs/>
-          <w:sz w:val="28"/>
-          <w:szCs w:val="32"/>
-        </w:rPr>
-        <w:t>Прецедент</w:t>
-      </w:r>
-      <w:r>
-        <w:rPr>
-          <w:rFonts w:ascii="Times New Roman" w:hAnsi="Times New Roman" w:cs="Times New Roman"/>
-          <w:b/>
-          <w:bCs/>
-          <w:sz w:val="28"/>
-          <w:szCs w:val="32"/>
-        </w:rPr>
-        <w:t xml:space="preserve"> 2:</w:t>
-      </w:r>
-      <w:r>
-        <w:rPr>
-          <w:rFonts w:ascii="Times New Roman" w:hAnsi="Times New Roman" w:cs="Times New Roman"/>
-          <w:b/>
-          <w:bCs/>
-          <w:sz w:val="28"/>
-          <w:szCs w:val="32"/>
-        </w:rPr>
-        <w:t xml:space="preserve"> «</w:t>
-      </w:r>
-      <w:r>
-        <w:rPr>
-          <w:rFonts w:ascii="Times New Roman" w:hAnsi="Times New Roman" w:cs="Times New Roman"/>
-          <w:b/>
-          <w:bCs/>
-          <w:sz w:val="28"/>
-          <w:szCs w:val="32"/>
-        </w:rPr>
-        <w:t>Изменить роль пользователя</w:t>
-      </w:r>
-      <w:r>
-        <w:rPr>
-          <w:rFonts w:ascii="Times New Roman" w:hAnsi="Times New Roman" w:cs="Times New Roman"/>
-          <w:b/>
-          <w:bCs/>
-          <w:sz w:val="28"/>
-          <w:szCs w:val="32"/>
-        </w:rPr>
-        <w:t>» («</w:t>
-      </w:r>
-      <w:r>
-        <w:rPr>
-          <w:rFonts w:ascii="Times New Roman" w:hAnsi="Times New Roman" w:cs="Times New Roman"/>
-          <w:b/>
-          <w:bCs/>
-          <w:sz w:val="28"/>
-          <w:szCs w:val="32"/>
-          <w:lang w:val="en-US"/>
-        </w:rPr>
-        <w:t>Change</w:t>
-      </w:r>
-      <w:r>
-        <w:rPr>
-          <w:rFonts w:ascii="Times New Roman" w:hAnsi="Times New Roman" w:cs="Times New Roman"/>
-          <w:b/>
-          <w:bCs/>
-          <w:sz w:val="28"/>
-          <w:szCs w:val="32"/>
-        </w:rPr>
-        <w:t xml:space="preserve"> </w:t>
-      </w:r>
-      <w:r>
-        <w:rPr>
-          <w:rFonts w:ascii="Times New Roman" w:hAnsi="Times New Roman" w:cs="Times New Roman"/>
-          <w:b/>
-          <w:bCs/>
-          <w:sz w:val="28"/>
-          <w:szCs w:val="32"/>
-          <w:lang w:val="en-US"/>
-        </w:rPr>
-        <w:t>user</w:t>
-      </w:r>
-      <w:r>
-        <w:rPr>
-          <w:rFonts w:ascii="Times New Roman" w:hAnsi="Times New Roman" w:cs="Times New Roman"/>
-          <w:b/>
-          <w:bCs/>
-          <w:sz w:val="28"/>
-          <w:szCs w:val="32"/>
-        </w:rPr>
-        <w:t xml:space="preserve"> </w:t>
-      </w:r>
-      <w:r>
-        <w:rPr>
-          <w:rFonts w:ascii="Times New Roman" w:hAnsi="Times New Roman" w:cs="Times New Roman"/>
-          <w:b/>
-          <w:bCs/>
-          <w:sz w:val="28"/>
-          <w:szCs w:val="32"/>
-          <w:lang w:val="en-US"/>
-        </w:rPr>
-        <w:t>role</w:t>
-      </w:r>
-      <w:r>
-        <w:rPr>
-          <w:rFonts w:ascii="Times New Roman" w:hAnsi="Times New Roman" w:cs="Times New Roman"/>
-          <w:b/>
-          <w:bCs/>
-          <w:sz w:val="28"/>
-          <w:szCs w:val="32"/>
-        </w:rPr>
-        <w:t>»).</w:t>
+          <w:i/>
+          <w:iCs/>
+          <w:sz w:val="28"/>
+          <w:szCs w:val="32"/>
+        </w:rPr>
+      </w:pPr>
+      <w:r>
+        <w:rPr>
+          <w:rFonts w:ascii="Times New Roman" w:hAnsi="Times New Roman" w:cs="Times New Roman"/>
+          <w:i/>
+          <w:iCs/>
+          <w:sz w:val="28"/>
+          <w:szCs w:val="32"/>
+        </w:rPr>
+        <w:t>Предусловие</w:t>
+      </w:r>
+      <w:r>
+        <w:rPr>
+          <w:rFonts w:ascii="Times New Roman" w:hAnsi="Times New Roman" w:cs="Times New Roman"/>
+          <w:sz w:val="28"/>
+          <w:szCs w:val="32"/>
+        </w:rPr>
+        <w:t>:</w:t>
+      </w:r>
+      <w:r>
+        <w:rPr>
+          <w:rFonts w:ascii="Times New Roman" w:hAnsi="Times New Roman" w:cs="Times New Roman"/>
+          <w:sz w:val="28"/>
+          <w:szCs w:val="32"/>
+        </w:rPr>
+        <w:t xml:space="preserve"> в системе должен присутствовать хотя бы один пользователь.</w:t>
       </w:r>
     </w:p>
     <w:p>
@@ -4529,21 +4563,19 @@
         <w:jc w:val="both"/>
         <w:rPr>
           <w:rFonts w:ascii="Times New Roman" w:hAnsi="Times New Roman" w:cs="Times New Roman"/>
+          <w:sz w:val="28"/>
+          <w:szCs w:val="32"/>
+        </w:rPr>
+      </w:pPr>
+      <w:r>
+        <w:rPr>
+          <w:rFonts w:ascii="Times New Roman" w:hAnsi="Times New Roman" w:cs="Times New Roman"/>
           <w:i/>
           <w:iCs/>
           <w:sz w:val="28"/>
           <w:szCs w:val="32"/>
         </w:rPr>
-      </w:pPr>
-      <w:r>
-        <w:rPr>
-          <w:rFonts w:ascii="Times New Roman" w:hAnsi="Times New Roman" w:cs="Times New Roman"/>
-          <w:i/>
-          <w:iCs/>
-          <w:sz w:val="28"/>
-          <w:szCs w:val="32"/>
-        </w:rPr>
-        <w:t>Предусловие</w:t>
+        <w:t>Действующее лицо</w:t>
       </w:r>
       <w:r>
         <w:rPr>
@@ -4559,7 +4591,7 @@
           <w:sz w:val="28"/>
           <w:szCs w:val="32"/>
         </w:rPr>
-        <w:t xml:space="preserve"> пользователь должен быть зарегистрирован в системе под ролью администратор, в системе должен присутствовать хотя бы еще один пользователь.</w:t>
+        <w:t xml:space="preserve"> администратор</w:t>
       </w:r>
     </w:p>
     <w:p>
@@ -4582,7 +4614,7 @@
           <w:sz w:val="28"/>
           <w:szCs w:val="32"/>
         </w:rPr>
-        <w:t>Действующее лицо</w:t>
+        <w:t>Основной поток</w:t>
       </w:r>
       <w:r>
         <w:rPr>
@@ -4598,7 +4630,56 @@
           <w:sz w:val="28"/>
           <w:szCs w:val="32"/>
         </w:rPr>
-        <w:t xml:space="preserve"> администратор</w:t>
+        <w:t xml:space="preserve"> </w:t>
+      </w:r>
+      <w:r>
+        <w:rPr>
+          <w:rFonts w:ascii="Times New Roman" w:hAnsi="Times New Roman" w:cs="Times New Roman"/>
+          <w:sz w:val="28"/>
+          <w:szCs w:val="32"/>
+        </w:rPr>
+        <w:t>администратор</w:t>
+      </w:r>
+      <w:r>
+        <w:rPr>
+          <w:rFonts w:ascii="Times New Roman" w:hAnsi="Times New Roman" w:cs="Times New Roman"/>
+          <w:sz w:val="28"/>
+          <w:szCs w:val="32"/>
+        </w:rPr>
+        <w:t xml:space="preserve"> магазина переходит в панель управления веб-приложением, перейдя по специальному </w:t>
+      </w:r>
+      <w:r>
+        <w:rPr>
+          <w:rFonts w:ascii="Times New Roman" w:hAnsi="Times New Roman" w:cs="Times New Roman"/>
+          <w:sz w:val="28"/>
+          <w:szCs w:val="32"/>
+          <w:lang w:val="en-US"/>
+        </w:rPr>
+        <w:t>URL</w:t>
+      </w:r>
+      <w:r>
+        <w:rPr>
+          <w:rFonts w:ascii="Times New Roman" w:hAnsi="Times New Roman" w:cs="Times New Roman"/>
+          <w:sz w:val="28"/>
+          <w:szCs w:val="32"/>
+        </w:rPr>
+        <w:t xml:space="preserve"> </w:t>
+      </w:r>
+      <w:r>
+        <w:rPr>
+          <w:rFonts w:ascii="Times New Roman" w:hAnsi="Times New Roman" w:cs="Times New Roman"/>
+          <w:sz w:val="28"/>
+          <w:szCs w:val="32"/>
+        </w:rPr>
+        <w:t>запросу</w:t>
+      </w:r>
+      <w:r>
+        <w:rPr>
+          <w:rFonts w:ascii="Times New Roman" w:hAnsi="Times New Roman" w:cs="Times New Roman"/>
+          <w:sz w:val="28"/>
+          <w:szCs w:val="32"/>
+        </w:rPr>
+        <w:t>.</w:t>
       </w:r>
     </w:p>
     <w:p>
@@ -4616,20 +4697,26 @@
       <w:r>
         <w:rPr>
           <w:rFonts w:ascii="Times New Roman" w:hAnsi="Times New Roman" w:cs="Times New Roman"/>
-          <w:i/>
-          <w:iCs/>
-          <w:sz w:val="28"/>
-          <w:szCs w:val="32"/>
-        </w:rPr>
-        <w:t>Основной поток</w:t>
-      </w:r>
-      <w:r>
-        <w:rPr>
-          <w:rFonts w:ascii="Times New Roman" w:hAnsi="Times New Roman" w:cs="Times New Roman"/>
-          <w:sz w:val="28"/>
-          <w:szCs w:val="32"/>
-        </w:rPr>
-        <w:t>:</w:t>
+          <w:sz w:val="28"/>
+          <w:szCs w:val="32"/>
+        </w:rPr>
+        <w:t xml:space="preserve">В панели управления выбирает пункт «Управление пользователями» и попадает на страницу со списком всех пользователей и доступных действиях с ними. </w:t>
+      </w:r>
+      <w:r>
+        <w:rPr>
+          <w:rFonts w:ascii="Times New Roman" w:hAnsi="Times New Roman" w:cs="Times New Roman"/>
+          <w:sz w:val="28"/>
+          <w:szCs w:val="32"/>
+        </w:rPr>
+        <w:t>Администратор</w:t>
+      </w:r>
+      <w:r>
+        <w:rPr>
+          <w:rFonts w:ascii="Times New Roman" w:hAnsi="Times New Roman" w:cs="Times New Roman"/>
+          <w:sz w:val="28"/>
+          <w:szCs w:val="32"/>
+        </w:rPr>
+        <w:t xml:space="preserve"> нажимает на кнопку «Изменить роль»</w:t>
       </w:r>
       <w:r>
         <w:rPr>
@@ -4645,40 +4732,79 @@
           <w:sz w:val="28"/>
           <w:szCs w:val="32"/>
         </w:rPr>
-        <w:t>администратор</w:t>
-      </w:r>
-      <w:r>
-        <w:rPr>
-          <w:rFonts w:ascii="Times New Roman" w:hAnsi="Times New Roman" w:cs="Times New Roman"/>
-          <w:sz w:val="28"/>
-          <w:szCs w:val="32"/>
-        </w:rPr>
-        <w:t xml:space="preserve"> магазина переходит в панель управления веб-приложением, перейдя по специальному </w:t>
-      </w:r>
-      <w:r>
-        <w:rPr>
-          <w:rFonts w:ascii="Times New Roman" w:hAnsi="Times New Roman" w:cs="Times New Roman"/>
-          <w:sz w:val="28"/>
-          <w:szCs w:val="32"/>
-          <w:lang w:val="en-US"/>
-        </w:rPr>
-        <w:t>URL</w:t>
-      </w:r>
-      <w:r>
-        <w:rPr>
-          <w:rFonts w:ascii="Times New Roman" w:hAnsi="Times New Roman" w:cs="Times New Roman"/>
-          <w:sz w:val="28"/>
-          <w:szCs w:val="32"/>
-        </w:rPr>
-        <w:t xml:space="preserve"> </w:t>
-      </w:r>
-      <w:r>
-        <w:rPr>
-          <w:rFonts w:ascii="Times New Roman" w:hAnsi="Times New Roman" w:cs="Times New Roman"/>
-          <w:sz w:val="28"/>
-          <w:szCs w:val="32"/>
-        </w:rPr>
-        <w:t>запросу, где вводит выданные ему данные: имя пользователя и пароль.</w:t>
+        <w:t>рядом с</w:t>
+      </w:r>
+      <w:r>
+        <w:rPr>
+          <w:rFonts w:ascii="Times New Roman" w:hAnsi="Times New Roman" w:cs="Times New Roman"/>
+          <w:sz w:val="28"/>
+          <w:szCs w:val="32"/>
+        </w:rPr>
+        <w:t xml:space="preserve"> интересующ</w:t>
+      </w:r>
+      <w:r>
+        <w:rPr>
+          <w:rFonts w:ascii="Times New Roman" w:hAnsi="Times New Roman" w:cs="Times New Roman"/>
+          <w:sz w:val="28"/>
+          <w:szCs w:val="32"/>
+        </w:rPr>
+        <w:t>им</w:t>
+      </w:r>
+      <w:r>
+        <w:rPr>
+          <w:rFonts w:ascii="Times New Roman" w:hAnsi="Times New Roman" w:cs="Times New Roman"/>
+          <w:sz w:val="28"/>
+          <w:szCs w:val="32"/>
+        </w:rPr>
+        <w:t xml:space="preserve"> пользовател</w:t>
+      </w:r>
+      <w:r>
+        <w:rPr>
+          <w:rFonts w:ascii="Times New Roman" w:hAnsi="Times New Roman" w:cs="Times New Roman"/>
+          <w:sz w:val="28"/>
+          <w:szCs w:val="32"/>
+        </w:rPr>
+        <w:t>ем</w:t>
+      </w:r>
+      <w:r>
+        <w:rPr>
+          <w:rFonts w:ascii="Times New Roman" w:hAnsi="Times New Roman" w:cs="Times New Roman"/>
+          <w:sz w:val="28"/>
+          <w:szCs w:val="32"/>
+        </w:rPr>
+        <w:t xml:space="preserve">, после чего </w:t>
+      </w:r>
+      <w:r>
+        <w:rPr>
+          <w:rFonts w:ascii="Times New Roman" w:hAnsi="Times New Roman" w:cs="Times New Roman"/>
+          <w:sz w:val="28"/>
+          <w:szCs w:val="32"/>
+        </w:rPr>
+        <w:t xml:space="preserve">из выпадающего списка </w:t>
+      </w:r>
+      <w:r>
+        <w:rPr>
+          <w:rFonts w:ascii="Times New Roman" w:hAnsi="Times New Roman" w:cs="Times New Roman"/>
+          <w:sz w:val="28"/>
+          <w:szCs w:val="32"/>
+        </w:rPr>
+        <w:t xml:space="preserve">необходимо выбрать роль и ввести пароль от аккаунта </w:t>
+      </w:r>
+      <w:r>
+        <w:rPr>
+          <w:rFonts w:ascii="Times New Roman" w:hAnsi="Times New Roman" w:cs="Times New Roman"/>
+          <w:sz w:val="28"/>
+          <w:szCs w:val="32"/>
+        </w:rPr>
+        <w:t xml:space="preserve">текущей </w:t>
+      </w:r>
+      <w:r>
+        <w:rPr>
+          <w:rFonts w:ascii="Times New Roman" w:hAnsi="Times New Roman" w:cs="Times New Roman"/>
+          <w:sz w:val="28"/>
+          <w:szCs w:val="32"/>
+        </w:rPr>
+        <w:t xml:space="preserve">активной сессии. </w:t>
       </w:r>
     </w:p>
     <w:p>
@@ -4699,23 +4825,7 @@
           <w:sz w:val="28"/>
           <w:szCs w:val="32"/>
         </w:rPr>
-        <w:t xml:space="preserve">В панели управления в боковом меню выбирает пункт «Управление пользователями» и попадает на страницу со списком всех пользователей и доступных действиях с ними. </w:t>
-      </w:r>
-      <w:r>
-        <w:rPr>
-          <w:rFonts w:ascii="Times New Roman" w:hAnsi="Times New Roman" w:cs="Times New Roman"/>
-          <w:sz w:val="28"/>
-          <w:szCs w:val="32"/>
-        </w:rPr>
-        <w:t>Администратор</w:t>
-      </w:r>
-      <w:r>
-        <w:rPr>
-          <w:rFonts w:ascii="Times New Roman" w:hAnsi="Times New Roman" w:cs="Times New Roman"/>
-          <w:sz w:val="28"/>
-          <w:szCs w:val="32"/>
-        </w:rPr>
-        <w:t xml:space="preserve"> нажимает на кнопку «Изменить роль»</w:t>
+        <w:t>При нажатии на кнопку «Применить»</w:t>
       </w:r>
       <w:r>
         <w:rPr>
@@ -4731,87 +4841,55 @@
           <w:sz w:val="28"/>
           <w:szCs w:val="32"/>
         </w:rPr>
-        <w:t>рядом с</w:t>
-      </w:r>
-      <w:r>
-        <w:rPr>
-          <w:rFonts w:ascii="Times New Roman" w:hAnsi="Times New Roman" w:cs="Times New Roman"/>
-          <w:sz w:val="28"/>
-          <w:szCs w:val="32"/>
-        </w:rPr>
-        <w:t xml:space="preserve"> интересующ</w:t>
-      </w:r>
-      <w:r>
-        <w:rPr>
-          <w:rFonts w:ascii="Times New Roman" w:hAnsi="Times New Roman" w:cs="Times New Roman"/>
-          <w:sz w:val="28"/>
-          <w:szCs w:val="32"/>
-        </w:rPr>
-        <w:t>им</w:t>
-      </w:r>
-      <w:r>
-        <w:rPr>
-          <w:rFonts w:ascii="Times New Roman" w:hAnsi="Times New Roman" w:cs="Times New Roman"/>
-          <w:sz w:val="28"/>
-          <w:szCs w:val="32"/>
-        </w:rPr>
-        <w:t xml:space="preserve"> пользовател</w:t>
-      </w:r>
-      <w:r>
-        <w:rPr>
-          <w:rFonts w:ascii="Times New Roman" w:hAnsi="Times New Roman" w:cs="Times New Roman"/>
-          <w:sz w:val="28"/>
-          <w:szCs w:val="32"/>
-        </w:rPr>
-        <w:t>ем</w:t>
-      </w:r>
-      <w:r>
-        <w:rPr>
-          <w:rFonts w:ascii="Times New Roman" w:hAnsi="Times New Roman" w:cs="Times New Roman"/>
-          <w:sz w:val="28"/>
-          <w:szCs w:val="32"/>
-        </w:rPr>
-        <w:t xml:space="preserve">, после чего </w:t>
-      </w:r>
-      <w:r>
-        <w:rPr>
-          <w:rFonts w:ascii="Times New Roman" w:hAnsi="Times New Roman" w:cs="Times New Roman"/>
-          <w:sz w:val="28"/>
-          <w:szCs w:val="32"/>
-        </w:rPr>
-        <w:t xml:space="preserve">открывается окно, где </w:t>
-      </w:r>
-      <w:r>
-        <w:rPr>
-          <w:rFonts w:ascii="Times New Roman" w:hAnsi="Times New Roman" w:cs="Times New Roman"/>
-          <w:sz w:val="28"/>
-          <w:szCs w:val="32"/>
-        </w:rPr>
-        <w:t xml:space="preserve">из выпадающего списка </w:t>
-      </w:r>
-      <w:r>
-        <w:rPr>
-          <w:rFonts w:ascii="Times New Roman" w:hAnsi="Times New Roman" w:cs="Times New Roman"/>
-          <w:sz w:val="28"/>
-          <w:szCs w:val="32"/>
-        </w:rPr>
-        <w:t xml:space="preserve">необходимо выбрать роль и ввести пароль от аккаунта </w:t>
-      </w:r>
-      <w:r>
-        <w:rPr>
-          <w:rFonts w:ascii="Times New Roman" w:hAnsi="Times New Roman" w:cs="Times New Roman"/>
-          <w:sz w:val="28"/>
-          <w:szCs w:val="32"/>
-        </w:rPr>
-        <w:t xml:space="preserve">текущей </w:t>
-      </w:r>
-      <w:r>
-        <w:rPr>
-          <w:rFonts w:ascii="Times New Roman" w:hAnsi="Times New Roman" w:cs="Times New Roman"/>
-          <w:sz w:val="28"/>
-          <w:szCs w:val="32"/>
-        </w:rPr>
-        <w:t xml:space="preserve">активной сессии. </w:t>
+        <w:t xml:space="preserve">администратор </w:t>
+      </w:r>
+      <w:r>
+        <w:rPr>
+          <w:rFonts w:ascii="Times New Roman" w:hAnsi="Times New Roman" w:cs="Times New Roman"/>
+          <w:sz w:val="28"/>
+          <w:szCs w:val="32"/>
+        </w:rPr>
+        <w:t>автоматически перенаправляется</w:t>
+      </w:r>
+      <w:r>
+        <w:rPr>
+          <w:rFonts w:ascii="Times New Roman" w:hAnsi="Times New Roman" w:cs="Times New Roman"/>
+          <w:sz w:val="28"/>
+          <w:szCs w:val="32"/>
+        </w:rPr>
+        <w:t xml:space="preserve"> на страницу со </w:t>
+      </w:r>
+      <w:r>
+        <w:rPr>
+          <w:rFonts w:ascii="Times New Roman" w:hAnsi="Times New Roman" w:cs="Times New Roman"/>
+          <w:sz w:val="28"/>
+          <w:szCs w:val="32"/>
+        </w:rPr>
+        <w:t>списком всех</w:t>
+      </w:r>
+      <w:r>
+        <w:rPr>
+          <w:rFonts w:ascii="Times New Roman" w:hAnsi="Times New Roman" w:cs="Times New Roman"/>
+          <w:sz w:val="28"/>
+          <w:szCs w:val="32"/>
+        </w:rPr>
+        <w:t xml:space="preserve"> пользовате</w:t>
+      </w:r>
+      <w:r>
+        <w:rPr>
+          <w:rFonts w:ascii="Times New Roman" w:hAnsi="Times New Roman" w:cs="Times New Roman"/>
+          <w:sz w:val="28"/>
+          <w:szCs w:val="32"/>
+        </w:rPr>
+        <w:t>лей</w:t>
+      </w:r>
+      <w:r>
+        <w:rPr>
+          <w:rFonts w:ascii="Times New Roman" w:hAnsi="Times New Roman" w:cs="Times New Roman"/>
+          <w:sz w:val="28"/>
+          <w:szCs w:val="32"/>
+        </w:rPr>
+        <w:t>.</w:t>
       </w:r>
     </w:p>
     <w:p>
@@ -4822,33 +4900,29 @@
         <w:jc w:val="both"/>
         <w:rPr>
           <w:rFonts w:ascii="Times New Roman" w:hAnsi="Times New Roman" w:cs="Times New Roman"/>
-          <w:sz w:val="28"/>
-          <w:szCs w:val="32"/>
-        </w:rPr>
-      </w:pPr>
-      <w:r>
-        <w:rPr>
-          <w:rFonts w:ascii="Times New Roman" w:hAnsi="Times New Roman" w:cs="Times New Roman"/>
-          <w:sz w:val="28"/>
-          <w:szCs w:val="32"/>
-        </w:rPr>
-        <w:t>При нажатии на кнопку «Применить»</w:t>
-      </w:r>
-      <w:r>
-        <w:rPr>
-          <w:rFonts w:ascii="Times New Roman" w:hAnsi="Times New Roman" w:cs="Times New Roman"/>
-          <w:sz w:val="28"/>
-          <w:szCs w:val="32"/>
-        </w:rPr>
-        <w:t xml:space="preserve"> отображается</w:t>
-      </w:r>
-      <w:r>
-        <w:rPr>
-          <w:rFonts w:ascii="Times New Roman" w:hAnsi="Times New Roman" w:cs="Times New Roman"/>
-          <w:sz w:val="28"/>
-          <w:szCs w:val="32"/>
-        </w:rPr>
-        <w:t xml:space="preserve"> окно с подтверждением действия.</w:t>
+          <w:i/>
+          <w:iCs/>
+          <w:sz w:val="28"/>
+          <w:szCs w:val="32"/>
+        </w:rPr>
+      </w:pPr>
+      <w:r>
+        <w:rPr>
+          <w:rFonts w:ascii="Times New Roman" w:hAnsi="Times New Roman" w:cs="Times New Roman"/>
+          <w:i/>
+          <w:iCs/>
+          <w:sz w:val="28"/>
+          <w:szCs w:val="32"/>
+        </w:rPr>
+        <w:t>Альтернативный поток</w:t>
+      </w:r>
+      <w:r>
+        <w:rPr>
+          <w:rFonts w:ascii="Times New Roman" w:hAnsi="Times New Roman" w:cs="Times New Roman"/>
+          <w:sz w:val="28"/>
+          <w:szCs w:val="32"/>
+        </w:rPr>
+        <w:t>:</w:t>
       </w:r>
       <w:r>
         <w:rPr>
@@ -4864,71 +4938,135 @@
           <w:sz w:val="28"/>
           <w:szCs w:val="32"/>
         </w:rPr>
-        <w:t xml:space="preserve">Подтвердив изменение роли на кнопку «Да», оба окна </w:t>
-      </w:r>
-      <w:r>
-        <w:rPr>
-          <w:rFonts w:ascii="Times New Roman" w:hAnsi="Times New Roman" w:cs="Times New Roman"/>
-          <w:sz w:val="28"/>
-          <w:szCs w:val="32"/>
-        </w:rPr>
-        <w:t xml:space="preserve">закрываются, и </w:t>
-      </w:r>
-      <w:r>
-        <w:rPr>
-          <w:rFonts w:ascii="Times New Roman" w:hAnsi="Times New Roman" w:cs="Times New Roman"/>
-          <w:sz w:val="28"/>
-          <w:szCs w:val="32"/>
-        </w:rPr>
-        <w:t xml:space="preserve">администратор </w:t>
-      </w:r>
-      <w:r>
-        <w:rPr>
-          <w:rFonts w:ascii="Times New Roman" w:hAnsi="Times New Roman" w:cs="Times New Roman"/>
-          <w:sz w:val="28"/>
-          <w:szCs w:val="32"/>
-        </w:rPr>
-        <w:t>автоматически перенаправляется</w:t>
-      </w:r>
-      <w:r>
-        <w:rPr>
-          <w:rFonts w:ascii="Times New Roman" w:hAnsi="Times New Roman" w:cs="Times New Roman"/>
-          <w:sz w:val="28"/>
-          <w:szCs w:val="32"/>
-        </w:rPr>
-        <w:t xml:space="preserve"> на страницу со </w:t>
-      </w:r>
-      <w:r>
-        <w:rPr>
-          <w:rFonts w:ascii="Times New Roman" w:hAnsi="Times New Roman" w:cs="Times New Roman"/>
-          <w:sz w:val="28"/>
-          <w:szCs w:val="32"/>
-        </w:rPr>
-        <w:t>списком всех</w:t>
-      </w:r>
-      <w:r>
-        <w:rPr>
-          <w:rFonts w:ascii="Times New Roman" w:hAnsi="Times New Roman" w:cs="Times New Roman"/>
-          <w:sz w:val="28"/>
-          <w:szCs w:val="32"/>
-        </w:rPr>
-        <w:t xml:space="preserve"> пользовате</w:t>
-      </w:r>
-      <w:r>
-        <w:rPr>
-          <w:rFonts w:ascii="Times New Roman" w:hAnsi="Times New Roman" w:cs="Times New Roman"/>
-          <w:sz w:val="28"/>
-          <w:szCs w:val="32"/>
-        </w:rPr>
-        <w:t>лей</w:t>
-      </w:r>
-      <w:r>
-        <w:rPr>
-          <w:rFonts w:ascii="Times New Roman" w:hAnsi="Times New Roman" w:cs="Times New Roman"/>
-          <w:sz w:val="28"/>
-          <w:szCs w:val="32"/>
-        </w:rPr>
-        <w:t>.</w:t>
+        <w:t>на этапе выбора роли из выпадающего списка</w:t>
+      </w:r>
+      <w:r>
+        <w:rPr>
+          <w:rFonts w:ascii="Times New Roman" w:hAnsi="Times New Roman" w:cs="Times New Roman"/>
+          <w:sz w:val="28"/>
+          <w:szCs w:val="32"/>
+        </w:rPr>
+        <w:t xml:space="preserve"> и ввода пароля текущей активной сессии </w:t>
+      </w:r>
+      <w:r>
+        <w:rPr>
+          <w:rFonts w:ascii="Times New Roman" w:hAnsi="Times New Roman" w:cs="Times New Roman"/>
+          <w:sz w:val="28"/>
+          <w:szCs w:val="32"/>
+        </w:rPr>
+        <w:t>администратор</w:t>
+      </w:r>
+      <w:r>
+        <w:rPr>
+          <w:rFonts w:ascii="Times New Roman" w:hAnsi="Times New Roman" w:cs="Times New Roman"/>
+          <w:sz w:val="28"/>
+          <w:szCs w:val="32"/>
+        </w:rPr>
+        <w:t xml:space="preserve"> </w:t>
+      </w:r>
+      <w:r>
+        <w:rPr>
+          <w:rFonts w:ascii="Times New Roman" w:hAnsi="Times New Roman" w:cs="Times New Roman"/>
+          <w:sz w:val="28"/>
+          <w:szCs w:val="32"/>
+        </w:rPr>
+        <w:t>трижды</w:t>
+      </w:r>
+      <w:r>
+        <w:rPr>
+          <w:rFonts w:ascii="Times New Roman" w:hAnsi="Times New Roman" w:cs="Times New Roman"/>
+          <w:sz w:val="28"/>
+          <w:szCs w:val="32"/>
+        </w:rPr>
+        <w:t xml:space="preserve"> вводит неверный пароль. В </w:t>
+      </w:r>
+      <w:r>
+        <w:rPr>
+          <w:rFonts w:ascii="Times New Roman" w:hAnsi="Times New Roman" w:cs="Times New Roman"/>
+          <w:sz w:val="28"/>
+          <w:szCs w:val="32"/>
+        </w:rPr>
+        <w:t>этом</w:t>
+      </w:r>
+      <w:r>
+        <w:rPr>
+          <w:rFonts w:ascii="Times New Roman" w:hAnsi="Times New Roman" w:cs="Times New Roman"/>
+          <w:sz w:val="28"/>
+          <w:szCs w:val="32"/>
+        </w:rPr>
+        <w:t xml:space="preserve"> случае</w:t>
+      </w:r>
+      <w:r>
+        <w:rPr>
+          <w:rFonts w:ascii="Times New Roman" w:hAnsi="Times New Roman" w:cs="Times New Roman"/>
+          <w:sz w:val="28"/>
+          <w:szCs w:val="32"/>
+        </w:rPr>
+        <w:t xml:space="preserve"> </w:t>
+      </w:r>
+      <w:r>
+        <w:rPr>
+          <w:rFonts w:ascii="Times New Roman" w:hAnsi="Times New Roman" w:cs="Times New Roman"/>
+          <w:sz w:val="28"/>
+          <w:szCs w:val="32"/>
+        </w:rPr>
+        <w:t xml:space="preserve">система </w:t>
+      </w:r>
+      <w:r>
+        <w:rPr>
+          <w:rFonts w:ascii="Times New Roman" w:hAnsi="Times New Roman" w:cs="Times New Roman"/>
+          <w:sz w:val="28"/>
+          <w:szCs w:val="32"/>
+        </w:rPr>
+        <w:t>расценивает</w:t>
+      </w:r>
+      <w:r>
+        <w:rPr>
+          <w:rFonts w:ascii="Times New Roman" w:hAnsi="Times New Roman" w:cs="Times New Roman"/>
+          <w:sz w:val="28"/>
+          <w:szCs w:val="32"/>
+        </w:rPr>
+        <w:t xml:space="preserve"> </w:t>
+      </w:r>
+      <w:r>
+        <w:rPr>
+          <w:rFonts w:ascii="Times New Roman" w:hAnsi="Times New Roman" w:cs="Times New Roman"/>
+          <w:sz w:val="28"/>
+          <w:szCs w:val="32"/>
+        </w:rPr>
+        <w:t>ситуацию</w:t>
+      </w:r>
+      <w:r>
+        <w:rPr>
+          <w:rFonts w:ascii="Times New Roman" w:hAnsi="Times New Roman" w:cs="Times New Roman"/>
+          <w:sz w:val="28"/>
+          <w:szCs w:val="32"/>
+        </w:rPr>
+        <w:t xml:space="preserve"> как попытку несанкционированн</w:t>
+      </w:r>
+      <w:r>
+        <w:rPr>
+          <w:rFonts w:ascii="Times New Roman" w:hAnsi="Times New Roman" w:cs="Times New Roman"/>
+          <w:sz w:val="28"/>
+          <w:szCs w:val="32"/>
+        </w:rPr>
+        <w:t>ого доступа</w:t>
+      </w:r>
+      <w:r>
+        <w:rPr>
+          <w:rFonts w:ascii="Times New Roman" w:hAnsi="Times New Roman" w:cs="Times New Roman"/>
+          <w:sz w:val="28"/>
+          <w:szCs w:val="32"/>
+        </w:rPr>
+        <w:t xml:space="preserve"> и </w:t>
+      </w:r>
+      <w:r>
+        <w:rPr>
+          <w:rFonts w:ascii="Times New Roman" w:hAnsi="Times New Roman" w:cs="Times New Roman"/>
+          <w:sz w:val="28"/>
+          <w:szCs w:val="32"/>
+        </w:rPr>
+        <w:t>завершает текущую сессию пользователя.</w:t>
       </w:r>
     </w:p>
     <w:p>
@@ -4953,7 +5091,7 @@
           <w:sz w:val="28"/>
           <w:szCs w:val="32"/>
         </w:rPr>
-        <w:t>Альтернативный поток</w:t>
+        <w:t>Постусловие</w:t>
       </w:r>
       <w:r>
         <w:rPr>
@@ -4969,143 +5107,15 @@
           <w:sz w:val="28"/>
           <w:szCs w:val="32"/>
         </w:rPr>
-        <w:t xml:space="preserve"> </w:t>
-      </w:r>
-      <w:r>
-        <w:rPr>
-          <w:rFonts w:ascii="Times New Roman" w:hAnsi="Times New Roman" w:cs="Times New Roman"/>
-          <w:sz w:val="28"/>
-          <w:szCs w:val="32"/>
-        </w:rPr>
-        <w:t>на этапе выбора роли из выпадающего списка</w:t>
-      </w:r>
-      <w:r>
-        <w:rPr>
-          <w:rFonts w:ascii="Times New Roman" w:hAnsi="Times New Roman" w:cs="Times New Roman"/>
-          <w:sz w:val="28"/>
-          <w:szCs w:val="32"/>
-        </w:rPr>
-        <w:t xml:space="preserve"> и ввода пароля текущей активной сессии </w:t>
-      </w:r>
-      <w:r>
-        <w:rPr>
-          <w:rFonts w:ascii="Times New Roman" w:hAnsi="Times New Roman" w:cs="Times New Roman"/>
-          <w:sz w:val="28"/>
-          <w:szCs w:val="32"/>
-        </w:rPr>
-        <w:t>администратор</w:t>
-      </w:r>
-      <w:r>
-        <w:rPr>
-          <w:rFonts w:ascii="Times New Roman" w:hAnsi="Times New Roman" w:cs="Times New Roman"/>
-          <w:sz w:val="28"/>
-          <w:szCs w:val="32"/>
-        </w:rPr>
-        <w:t xml:space="preserve"> </w:t>
-      </w:r>
-      <w:r>
-        <w:rPr>
-          <w:rFonts w:ascii="Times New Roman" w:hAnsi="Times New Roman" w:cs="Times New Roman"/>
-          <w:sz w:val="28"/>
-          <w:szCs w:val="32"/>
-        </w:rPr>
-        <w:t>трижды</w:t>
-      </w:r>
-      <w:r>
-        <w:rPr>
-          <w:rFonts w:ascii="Times New Roman" w:hAnsi="Times New Roman" w:cs="Times New Roman"/>
-          <w:sz w:val="28"/>
-          <w:szCs w:val="32"/>
-        </w:rPr>
-        <w:t xml:space="preserve"> вводит неверный пароль. В </w:t>
-      </w:r>
-      <w:r>
-        <w:rPr>
-          <w:rFonts w:ascii="Times New Roman" w:hAnsi="Times New Roman" w:cs="Times New Roman"/>
-          <w:sz w:val="28"/>
-          <w:szCs w:val="32"/>
-        </w:rPr>
-        <w:t>этом</w:t>
-      </w:r>
-      <w:r>
-        <w:rPr>
-          <w:rFonts w:ascii="Times New Roman" w:hAnsi="Times New Roman" w:cs="Times New Roman"/>
-          <w:sz w:val="28"/>
-          <w:szCs w:val="32"/>
-        </w:rPr>
-        <w:t xml:space="preserve"> случае</w:t>
-      </w:r>
-      <w:r>
-        <w:rPr>
-          <w:rFonts w:ascii="Times New Roman" w:hAnsi="Times New Roman" w:cs="Times New Roman"/>
-          <w:sz w:val="28"/>
-          <w:szCs w:val="32"/>
-        </w:rPr>
-        <w:t xml:space="preserve"> </w:t>
-      </w:r>
-      <w:r>
-        <w:rPr>
-          <w:rFonts w:ascii="Times New Roman" w:hAnsi="Times New Roman" w:cs="Times New Roman"/>
-          <w:sz w:val="28"/>
-          <w:szCs w:val="32"/>
-        </w:rPr>
-        <w:t xml:space="preserve">система </w:t>
-      </w:r>
-      <w:r>
-        <w:rPr>
-          <w:rFonts w:ascii="Times New Roman" w:hAnsi="Times New Roman" w:cs="Times New Roman"/>
-          <w:sz w:val="28"/>
-          <w:szCs w:val="32"/>
-        </w:rPr>
-        <w:t>расценивает</w:t>
-      </w:r>
-      <w:r>
-        <w:rPr>
-          <w:rFonts w:ascii="Times New Roman" w:hAnsi="Times New Roman" w:cs="Times New Roman"/>
-          <w:sz w:val="28"/>
-          <w:szCs w:val="32"/>
-        </w:rPr>
-        <w:t xml:space="preserve"> </w:t>
-      </w:r>
-      <w:r>
-        <w:rPr>
-          <w:rFonts w:ascii="Times New Roman" w:hAnsi="Times New Roman" w:cs="Times New Roman"/>
-          <w:sz w:val="28"/>
-          <w:szCs w:val="32"/>
-        </w:rPr>
-        <w:t>ситуацию</w:t>
-      </w:r>
-      <w:r>
-        <w:rPr>
-          <w:rFonts w:ascii="Times New Roman" w:hAnsi="Times New Roman" w:cs="Times New Roman"/>
-          <w:sz w:val="28"/>
-          <w:szCs w:val="32"/>
-        </w:rPr>
-        <w:t xml:space="preserve"> как попытку несанкционированн</w:t>
-      </w:r>
-      <w:r>
-        <w:rPr>
-          <w:rFonts w:ascii="Times New Roman" w:hAnsi="Times New Roman" w:cs="Times New Roman"/>
-          <w:sz w:val="28"/>
-          <w:szCs w:val="32"/>
-        </w:rPr>
-        <w:t>ого доступа</w:t>
-      </w:r>
-      <w:r>
-        <w:rPr>
-          <w:rFonts w:ascii="Times New Roman" w:hAnsi="Times New Roman" w:cs="Times New Roman"/>
-          <w:sz w:val="28"/>
-          <w:szCs w:val="32"/>
-        </w:rPr>
-        <w:t xml:space="preserve"> и </w:t>
-      </w:r>
-      <w:r>
-        <w:rPr>
-          <w:rFonts w:ascii="Times New Roman" w:hAnsi="Times New Roman" w:cs="Times New Roman"/>
-          <w:sz w:val="28"/>
-          <w:szCs w:val="32"/>
-        </w:rPr>
-        <w:t>завершает текущую сессию пользователя.</w:t>
+        <w:t xml:space="preserve"> роль пользователя изменяется в системе, что дает или отнимает права взаимодействия с веб-приложением, роль пользователя отображается в панели управления в списке со всеми пользователями</w:t>
+      </w:r>
+      <w:r>
+        <w:rPr>
+          <w:rFonts w:ascii="Times New Roman" w:hAnsi="Times New Roman" w:cs="Times New Roman"/>
+          <w:sz w:val="28"/>
+          <w:szCs w:val="32"/>
+        </w:rPr>
+        <w:t>.</w:t>
       </w:r>
     </w:p>
     <w:p>
@@ -5116,46 +5126,128 @@
         <w:jc w:val="both"/>
         <w:rPr>
           <w:rFonts w:ascii="Times New Roman" w:hAnsi="Times New Roman" w:cs="Times New Roman"/>
-          <w:i/>
-          <w:iCs/>
-          <w:sz w:val="28"/>
-          <w:szCs w:val="32"/>
-        </w:rPr>
-      </w:pPr>
-      <w:r>
-        <w:rPr>
-          <w:rFonts w:ascii="Times New Roman" w:hAnsi="Times New Roman" w:cs="Times New Roman"/>
-          <w:i/>
-          <w:iCs/>
-          <w:sz w:val="28"/>
-          <w:szCs w:val="32"/>
-        </w:rPr>
-        <w:lastRenderedPageBreak/>
-        <w:t>Постусловие</w:t>
-      </w:r>
-      <w:r>
-        <w:rPr>
-          <w:rFonts w:ascii="Times New Roman" w:hAnsi="Times New Roman" w:cs="Times New Roman"/>
-          <w:sz w:val="28"/>
-          <w:szCs w:val="32"/>
-        </w:rPr>
-        <w:t>:</w:t>
-      </w:r>
-      <w:r>
-        <w:rPr>
-          <w:rFonts w:ascii="Times New Roman" w:hAnsi="Times New Roman" w:cs="Times New Roman"/>
-          <w:sz w:val="28"/>
-          <w:szCs w:val="32"/>
-        </w:rPr>
-        <w:t xml:space="preserve"> роль пользователя изменяется в системе, что дает или отнимает права взаимодействия с веб-приложением, роль пользователя отображается в панели управления в списке со всеми пользователями</w:t>
-      </w:r>
-      <w:r>
-        <w:rPr>
-          <w:rFonts w:ascii="Times New Roman" w:hAnsi="Times New Roman" w:cs="Times New Roman"/>
-          <w:sz w:val="28"/>
-          <w:szCs w:val="32"/>
-        </w:rPr>
-        <w:t>.</w:t>
+          <w:b/>
+          <w:bCs/>
+          <w:sz w:val="28"/>
+          <w:szCs w:val="32"/>
+        </w:rPr>
+      </w:pPr>
+      <w:r>
+        <w:t xml:space="preserve"> </w:t>
+      </w:r>
+      <w:r>
+        <w:rPr>
+          <w:rFonts w:ascii="Times New Roman" w:hAnsi="Times New Roman" w:cs="Times New Roman"/>
+          <w:b/>
+          <w:bCs/>
+          <w:sz w:val="28"/>
+          <w:szCs w:val="32"/>
+        </w:rPr>
+        <w:t xml:space="preserve">Прецедент </w:t>
+      </w:r>
+      <w:r>
+        <w:rPr>
+          <w:rFonts w:ascii="Times New Roman" w:hAnsi="Times New Roman" w:cs="Times New Roman"/>
+          <w:b/>
+          <w:bCs/>
+          <w:sz w:val="28"/>
+          <w:szCs w:val="32"/>
+        </w:rPr>
+        <w:t>3</w:t>
+      </w:r>
+      <w:r>
+        <w:rPr>
+          <w:rFonts w:ascii="Times New Roman" w:hAnsi="Times New Roman" w:cs="Times New Roman"/>
+          <w:b/>
+          <w:bCs/>
+          <w:sz w:val="28"/>
+          <w:szCs w:val="32"/>
+        </w:rPr>
+        <w:t xml:space="preserve">: </w:t>
+      </w:r>
+      <w:r>
+        <w:rPr>
+          <w:rFonts w:ascii="Times New Roman" w:hAnsi="Times New Roman" w:cs="Times New Roman"/>
+          <w:b/>
+          <w:bCs/>
+          <w:sz w:val="28"/>
+          <w:szCs w:val="32"/>
+        </w:rPr>
+        <w:t>«Просмотр статистики продаж» («</w:t>
+      </w:r>
+      <w:r>
+        <w:rPr>
+          <w:rFonts w:ascii="Times New Roman" w:hAnsi="Times New Roman" w:cs="Times New Roman"/>
+          <w:b/>
+          <w:bCs/>
+          <w:sz w:val="28"/>
+          <w:szCs w:val="32"/>
+          <w:lang w:val="en-US"/>
+        </w:rPr>
+        <w:t>View</w:t>
+      </w:r>
+      <w:r>
+        <w:rPr>
+          <w:rFonts w:ascii="Times New Roman" w:hAnsi="Times New Roman" w:cs="Times New Roman"/>
+          <w:b/>
+          <w:bCs/>
+          <w:sz w:val="28"/>
+          <w:szCs w:val="32"/>
+        </w:rPr>
+        <w:t xml:space="preserve"> </w:t>
+      </w:r>
+      <w:r>
+        <w:rPr>
+          <w:rFonts w:ascii="Times New Roman" w:hAnsi="Times New Roman" w:cs="Times New Roman"/>
+          <w:b/>
+          <w:bCs/>
+          <w:sz w:val="28"/>
+          <w:szCs w:val="32"/>
+          <w:lang w:val="en-US"/>
+        </w:rPr>
+        <w:t>sales</w:t>
+      </w:r>
+      <w:r>
+        <w:rPr>
+          <w:rFonts w:ascii="Times New Roman" w:hAnsi="Times New Roman" w:cs="Times New Roman"/>
+          <w:b/>
+          <w:bCs/>
+          <w:sz w:val="28"/>
+          <w:szCs w:val="32"/>
+        </w:rPr>
+        <w:t xml:space="preserve"> </w:t>
+      </w:r>
+      <w:r>
+        <w:rPr>
+          <w:rFonts w:ascii="Times New Roman" w:hAnsi="Times New Roman" w:cs="Times New Roman"/>
+          <w:b/>
+          <w:bCs/>
+          <w:sz w:val="28"/>
+          <w:szCs w:val="32"/>
+          <w:lang w:val="en-US"/>
+        </w:rPr>
+        <w:t>statistic</w:t>
+      </w:r>
+      <w:r>
+        <w:rPr>
+          <w:rFonts w:ascii="Times New Roman" w:hAnsi="Times New Roman" w:cs="Times New Roman"/>
+          <w:b/>
+          <w:bCs/>
+          <w:sz w:val="28"/>
+          <w:szCs w:val="32"/>
+          <w:lang w:val="en-US"/>
+        </w:rPr>
+        <w:t>s</w:t>
+      </w:r>
+      <w:r>
+        <w:rPr>
+          <w:rFonts w:ascii="Times New Roman" w:hAnsi="Times New Roman" w:cs="Times New Roman"/>
+          <w:b/>
+          <w:bCs/>
+          <w:sz w:val="28"/>
+          <w:szCs w:val="32"/>
+        </w:rPr>
+        <w:t>»).</w:t>
       </w:r>
     </w:p>
     <w:p>
@@ -5166,128 +5258,43 @@
         <w:jc w:val="both"/>
         <w:rPr>
           <w:rFonts w:ascii="Times New Roman" w:hAnsi="Times New Roman" w:cs="Times New Roman"/>
-          <w:b/>
-          <w:bCs/>
-          <w:sz w:val="28"/>
-          <w:szCs w:val="32"/>
-        </w:rPr>
-      </w:pPr>
-      <w:r>
-        <w:t xml:space="preserve"> </w:t>
-      </w:r>
-      <w:r>
-        <w:rPr>
-          <w:rFonts w:ascii="Times New Roman" w:hAnsi="Times New Roman" w:cs="Times New Roman"/>
-          <w:b/>
-          <w:bCs/>
-          <w:sz w:val="28"/>
-          <w:szCs w:val="32"/>
-        </w:rPr>
-        <w:t xml:space="preserve">Прецедент </w:t>
-      </w:r>
-      <w:r>
-        <w:rPr>
-          <w:rFonts w:ascii="Times New Roman" w:hAnsi="Times New Roman" w:cs="Times New Roman"/>
-          <w:b/>
-          <w:bCs/>
-          <w:sz w:val="28"/>
-          <w:szCs w:val="32"/>
-        </w:rPr>
-        <w:t>3</w:t>
-      </w:r>
-      <w:r>
-        <w:rPr>
-          <w:rFonts w:ascii="Times New Roman" w:hAnsi="Times New Roman" w:cs="Times New Roman"/>
-          <w:b/>
-          <w:bCs/>
-          <w:sz w:val="28"/>
-          <w:szCs w:val="32"/>
-        </w:rPr>
-        <w:t xml:space="preserve">: </w:t>
-      </w:r>
-      <w:r>
-        <w:rPr>
-          <w:rFonts w:ascii="Times New Roman" w:hAnsi="Times New Roman" w:cs="Times New Roman"/>
-          <w:b/>
-          <w:bCs/>
-          <w:sz w:val="28"/>
-          <w:szCs w:val="32"/>
-        </w:rPr>
-        <w:t>«Просмотр статистики продаж» («</w:t>
-      </w:r>
-      <w:r>
-        <w:rPr>
-          <w:rFonts w:ascii="Times New Roman" w:hAnsi="Times New Roman" w:cs="Times New Roman"/>
-          <w:b/>
-          <w:bCs/>
-          <w:sz w:val="28"/>
-          <w:szCs w:val="32"/>
-          <w:lang w:val="en-US"/>
-        </w:rPr>
-        <w:t>View</w:t>
-      </w:r>
-      <w:r>
-        <w:rPr>
-          <w:rFonts w:ascii="Times New Roman" w:hAnsi="Times New Roman" w:cs="Times New Roman"/>
-          <w:b/>
-          <w:bCs/>
-          <w:sz w:val="28"/>
-          <w:szCs w:val="32"/>
-        </w:rPr>
-        <w:t xml:space="preserve"> </w:t>
-      </w:r>
-      <w:r>
-        <w:rPr>
-          <w:rFonts w:ascii="Times New Roman" w:hAnsi="Times New Roman" w:cs="Times New Roman"/>
-          <w:b/>
-          <w:bCs/>
-          <w:sz w:val="28"/>
-          <w:szCs w:val="32"/>
-          <w:lang w:val="en-US"/>
-        </w:rPr>
-        <w:t>sales</w:t>
-      </w:r>
-      <w:r>
-        <w:rPr>
-          <w:rFonts w:ascii="Times New Roman" w:hAnsi="Times New Roman" w:cs="Times New Roman"/>
-          <w:b/>
-          <w:bCs/>
-          <w:sz w:val="28"/>
-          <w:szCs w:val="32"/>
-        </w:rPr>
-        <w:t xml:space="preserve"> </w:t>
-      </w:r>
-      <w:r>
-        <w:rPr>
-          <w:rFonts w:ascii="Times New Roman" w:hAnsi="Times New Roman" w:cs="Times New Roman"/>
-          <w:b/>
-          <w:bCs/>
-          <w:sz w:val="28"/>
-          <w:szCs w:val="32"/>
-          <w:lang w:val="en-US"/>
-        </w:rPr>
-        <w:t>statistic</w:t>
-      </w:r>
-      <w:r>
-        <w:rPr>
-          <w:rFonts w:ascii="Times New Roman" w:hAnsi="Times New Roman" w:cs="Times New Roman"/>
-          <w:b/>
-          <w:bCs/>
-          <w:sz w:val="28"/>
-          <w:szCs w:val="32"/>
-          <w:lang w:val="en-US"/>
-        </w:rPr>
-        <w:t>s</w:t>
-      </w:r>
-      <w:r>
-        <w:rPr>
-          <w:rFonts w:ascii="Times New Roman" w:hAnsi="Times New Roman" w:cs="Times New Roman"/>
-          <w:b/>
-          <w:bCs/>
-          <w:sz w:val="28"/>
-          <w:szCs w:val="32"/>
-        </w:rPr>
-        <w:t>»).</w:t>
+          <w:sz w:val="28"/>
+          <w:szCs w:val="32"/>
+        </w:rPr>
+      </w:pPr>
+      <w:r>
+        <w:rPr>
+          <w:rFonts w:ascii="Times New Roman" w:hAnsi="Times New Roman" w:cs="Times New Roman"/>
+          <w:i/>
+          <w:iCs/>
+          <w:sz w:val="28"/>
+          <w:szCs w:val="32"/>
+        </w:rPr>
+        <w:t>Действующее лицо</w:t>
+      </w:r>
+      <w:r>
+        <w:rPr>
+          <w:rFonts w:ascii="Times New Roman" w:hAnsi="Times New Roman" w:cs="Times New Roman"/>
+          <w:sz w:val="28"/>
+          <w:szCs w:val="32"/>
+        </w:rPr>
+        <w:t>:</w:t>
+      </w:r>
+      <w:r>
+        <w:rPr>
+          <w:rFonts w:ascii="Times New Roman" w:hAnsi="Times New Roman" w:cs="Times New Roman"/>
+          <w:sz w:val="28"/>
+          <w:szCs w:val="32"/>
+        </w:rPr>
+        <w:t xml:space="preserve"> сотрудник</w:t>
+      </w:r>
+      <w:r>
+        <w:rPr>
+          <w:rFonts w:ascii="Times New Roman" w:hAnsi="Times New Roman" w:cs="Times New Roman"/>
+          <w:sz w:val="28"/>
+          <w:szCs w:val="32"/>
+        </w:rPr>
+        <w:t>.</w:t>
       </w:r>
     </w:p>
     <w:p>
@@ -5298,21 +5305,19 @@
         <w:jc w:val="both"/>
         <w:rPr>
           <w:rFonts w:ascii="Times New Roman" w:hAnsi="Times New Roman" w:cs="Times New Roman"/>
+          <w:sz w:val="28"/>
+          <w:szCs w:val="32"/>
+        </w:rPr>
+      </w:pPr>
+      <w:r>
+        <w:rPr>
+          <w:rFonts w:ascii="Times New Roman" w:hAnsi="Times New Roman" w:cs="Times New Roman"/>
           <w:i/>
           <w:iCs/>
           <w:sz w:val="28"/>
           <w:szCs w:val="32"/>
         </w:rPr>
-      </w:pPr>
-      <w:r>
-        <w:rPr>
-          <w:rFonts w:ascii="Times New Roman" w:hAnsi="Times New Roman" w:cs="Times New Roman"/>
-          <w:i/>
-          <w:iCs/>
-          <w:sz w:val="28"/>
-          <w:szCs w:val="32"/>
-        </w:rPr>
-        <w:t>Предусловие</w:t>
+        <w:t>Основной поток</w:t>
       </w:r>
       <w:r>
         <w:rPr>
@@ -5328,7 +5333,153 @@
           <w:sz w:val="28"/>
           <w:szCs w:val="32"/>
         </w:rPr>
-        <w:t xml:space="preserve"> пользователь должен быть зарегистрирован в системе под ролью сотрудник или администратор.</w:t>
+        <w:t xml:space="preserve"> сотрудник магазина переходит в панель управления веб-приложением, перейдя по специальному </w:t>
+      </w:r>
+      <w:r>
+        <w:rPr>
+          <w:rFonts w:ascii="Times New Roman" w:hAnsi="Times New Roman" w:cs="Times New Roman"/>
+          <w:sz w:val="28"/>
+          <w:szCs w:val="32"/>
+          <w:lang w:val="en-US"/>
+        </w:rPr>
+        <w:t>URL</w:t>
+      </w:r>
+      <w:r>
+        <w:rPr>
+          <w:rFonts w:ascii="Times New Roman" w:hAnsi="Times New Roman" w:cs="Times New Roman"/>
+          <w:sz w:val="28"/>
+          <w:szCs w:val="32"/>
+        </w:rPr>
+        <w:t xml:space="preserve"> </w:t>
+      </w:r>
+      <w:r>
+        <w:rPr>
+          <w:rFonts w:ascii="Times New Roman" w:hAnsi="Times New Roman" w:cs="Times New Roman"/>
+          <w:sz w:val="28"/>
+          <w:szCs w:val="32"/>
+        </w:rPr>
+        <w:t xml:space="preserve">запросу. При переходе отображается </w:t>
+      </w:r>
+      <w:r>
+        <w:rPr>
+          <w:rFonts w:ascii="Times New Roman" w:hAnsi="Times New Roman" w:cs="Times New Roman"/>
+          <w:sz w:val="28"/>
+          <w:szCs w:val="32"/>
+        </w:rPr>
+        <w:t>главная</w:t>
+      </w:r>
+      <w:r>
+        <w:rPr>
+          <w:rFonts w:ascii="Times New Roman" w:hAnsi="Times New Roman" w:cs="Times New Roman"/>
+          <w:sz w:val="28"/>
+          <w:szCs w:val="32"/>
+        </w:rPr>
+        <w:t xml:space="preserve"> страница </w:t>
+      </w:r>
+      <w:r>
+        <w:rPr>
+          <w:rFonts w:ascii="Times New Roman" w:hAnsi="Times New Roman" w:cs="Times New Roman"/>
+          <w:sz w:val="28"/>
+          <w:szCs w:val="32"/>
+        </w:rPr>
+        <w:t>панели, содержащая</w:t>
+      </w:r>
+      <w:r>
+        <w:rPr>
+          <w:rFonts w:ascii="Times New Roman" w:hAnsi="Times New Roman" w:cs="Times New Roman"/>
+          <w:sz w:val="28"/>
+          <w:szCs w:val="32"/>
+        </w:rPr>
+        <w:t xml:space="preserve"> некоторы</w:t>
+      </w:r>
+      <w:r>
+        <w:rPr>
+          <w:rFonts w:ascii="Times New Roman" w:hAnsi="Times New Roman" w:cs="Times New Roman"/>
+          <w:sz w:val="28"/>
+          <w:szCs w:val="32"/>
+        </w:rPr>
+        <w:t xml:space="preserve">е </w:t>
+      </w:r>
+      <w:r>
+        <w:rPr>
+          <w:rFonts w:ascii="Times New Roman" w:hAnsi="Times New Roman" w:cs="Times New Roman"/>
+          <w:sz w:val="28"/>
+          <w:szCs w:val="32"/>
+        </w:rPr>
+        <w:t>кратк</w:t>
+      </w:r>
+      <w:r>
+        <w:rPr>
+          <w:rFonts w:ascii="Times New Roman" w:hAnsi="Times New Roman" w:cs="Times New Roman"/>
+          <w:sz w:val="28"/>
+          <w:szCs w:val="32"/>
+        </w:rPr>
+        <w:t>ие</w:t>
+      </w:r>
+      <w:r>
+        <w:rPr>
+          <w:rFonts w:ascii="Times New Roman" w:hAnsi="Times New Roman" w:cs="Times New Roman"/>
+          <w:sz w:val="28"/>
+          <w:szCs w:val="32"/>
+        </w:rPr>
+        <w:t xml:space="preserve"> </w:t>
+      </w:r>
+      <w:r>
+        <w:rPr>
+          <w:rFonts w:ascii="Times New Roman" w:hAnsi="Times New Roman" w:cs="Times New Roman"/>
+          <w:sz w:val="28"/>
+          <w:szCs w:val="32"/>
+        </w:rPr>
+        <w:lastRenderedPageBreak/>
+        <w:t>статистически</w:t>
+      </w:r>
+      <w:r>
+        <w:rPr>
+          <w:rFonts w:ascii="Times New Roman" w:hAnsi="Times New Roman" w:cs="Times New Roman"/>
+          <w:sz w:val="28"/>
+          <w:szCs w:val="32"/>
+        </w:rPr>
+        <w:t>е</w:t>
+      </w:r>
+      <w:r>
+        <w:rPr>
+          <w:rFonts w:ascii="Times New Roman" w:hAnsi="Times New Roman" w:cs="Times New Roman"/>
+          <w:sz w:val="28"/>
+          <w:szCs w:val="32"/>
+        </w:rPr>
+        <w:t xml:space="preserve"> данны</w:t>
+      </w:r>
+      <w:r>
+        <w:rPr>
+          <w:rFonts w:ascii="Times New Roman" w:hAnsi="Times New Roman" w:cs="Times New Roman"/>
+          <w:sz w:val="28"/>
+          <w:szCs w:val="32"/>
+        </w:rPr>
+        <w:t>е</w:t>
+      </w:r>
+      <w:r>
+        <w:rPr>
+          <w:rFonts w:ascii="Times New Roman" w:hAnsi="Times New Roman" w:cs="Times New Roman"/>
+          <w:sz w:val="28"/>
+          <w:szCs w:val="32"/>
+        </w:rPr>
+        <w:t xml:space="preserve">, например, </w:t>
+      </w:r>
+      <w:r>
+        <w:rPr>
+          <w:rFonts w:ascii="Times New Roman" w:hAnsi="Times New Roman" w:cs="Times New Roman"/>
+          <w:sz w:val="28"/>
+          <w:szCs w:val="32"/>
+        </w:rPr>
+        <w:t xml:space="preserve">показатели </w:t>
+      </w:r>
+      <w:r>
+        <w:rPr>
+          <w:rFonts w:ascii="Times New Roman" w:hAnsi="Times New Roman" w:cs="Times New Roman"/>
+          <w:sz w:val="28"/>
+          <w:szCs w:val="32"/>
+        </w:rPr>
+        <w:t>продажи за определенный период в виде диаграммы.</w:t>
       </w:r>
     </w:p>
     <w:p>
@@ -5339,43 +5490,35 @@
         <w:jc w:val="both"/>
         <w:rPr>
           <w:rFonts w:ascii="Times New Roman" w:hAnsi="Times New Roman" w:cs="Times New Roman"/>
-          <w:sz w:val="28"/>
-          <w:szCs w:val="32"/>
-        </w:rPr>
-      </w:pPr>
-      <w:r>
-        <w:rPr>
-          <w:rFonts w:ascii="Times New Roman" w:hAnsi="Times New Roman" w:cs="Times New Roman"/>
           <w:i/>
           <w:iCs/>
           <w:sz w:val="28"/>
           <w:szCs w:val="32"/>
         </w:rPr>
-        <w:t>Действующее лицо</w:t>
-      </w:r>
-      <w:r>
-        <w:rPr>
-          <w:rFonts w:ascii="Times New Roman" w:hAnsi="Times New Roman" w:cs="Times New Roman"/>
-          <w:sz w:val="28"/>
-          <w:szCs w:val="32"/>
-        </w:rPr>
-        <w:t>:</w:t>
-      </w:r>
-      <w:r>
-        <w:rPr>
-          <w:rFonts w:ascii="Times New Roman" w:hAnsi="Times New Roman" w:cs="Times New Roman"/>
-          <w:sz w:val="28"/>
-          <w:szCs w:val="32"/>
-        </w:rPr>
-        <w:t xml:space="preserve"> сотрудник</w:t>
-      </w:r>
-      <w:r>
-        <w:rPr>
-          <w:rFonts w:ascii="Times New Roman" w:hAnsi="Times New Roman" w:cs="Times New Roman"/>
-          <w:sz w:val="28"/>
-          <w:szCs w:val="32"/>
-        </w:rPr>
-        <w:t>.</w:t>
+      </w:pPr>
+      <w:r>
+        <w:rPr>
+          <w:rFonts w:ascii="Times New Roman" w:hAnsi="Times New Roman" w:cs="Times New Roman"/>
+          <w:sz w:val="28"/>
+          <w:szCs w:val="32"/>
+        </w:rPr>
+        <w:t xml:space="preserve">В панели управления </w:t>
+      </w:r>
+      <w:r>
+        <w:rPr>
+          <w:rFonts w:ascii="Times New Roman" w:hAnsi="Times New Roman" w:cs="Times New Roman"/>
+          <w:sz w:val="28"/>
+          <w:szCs w:val="32"/>
+        </w:rPr>
+        <w:t xml:space="preserve">сотрудник </w:t>
+      </w:r>
+      <w:r>
+        <w:rPr>
+          <w:rFonts w:ascii="Times New Roman" w:hAnsi="Times New Roman" w:cs="Times New Roman"/>
+          <w:sz w:val="28"/>
+          <w:szCs w:val="32"/>
+        </w:rPr>
+        <w:t>выбирает пункт «Статистика», тем самым попадая на страницу с более детальными статистическим данными и собранными метриками.</w:t>
       </w:r>
     </w:p>
     <w:p>
@@ -5386,19 +5529,21 @@
         <w:jc w:val="both"/>
         <w:rPr>
           <w:rFonts w:ascii="Times New Roman" w:hAnsi="Times New Roman" w:cs="Times New Roman"/>
-          <w:sz w:val="28"/>
-          <w:szCs w:val="32"/>
-        </w:rPr>
-      </w:pPr>
-      <w:r>
-        <w:rPr>
-          <w:rFonts w:ascii="Times New Roman" w:hAnsi="Times New Roman" w:cs="Times New Roman"/>
           <w:i/>
           <w:iCs/>
           <w:sz w:val="28"/>
           <w:szCs w:val="32"/>
         </w:rPr>
-        <w:t>Основной поток</w:t>
+      </w:pPr>
+      <w:r>
+        <w:rPr>
+          <w:rFonts w:ascii="Times New Roman" w:hAnsi="Times New Roman" w:cs="Times New Roman"/>
+          <w:i/>
+          <w:iCs/>
+          <w:sz w:val="28"/>
+          <w:szCs w:val="32"/>
+        </w:rPr>
+        <w:t>Альтернативный поток</w:t>
       </w:r>
       <w:r>
         <w:rPr>
@@ -5414,7 +5559,7 @@
           <w:sz w:val="28"/>
           <w:szCs w:val="32"/>
         </w:rPr>
-        <w:t xml:space="preserve"> сотрудник магазина переходит в панель управления веб-приложением, перейдя по специальному </w:t>
+        <w:t xml:space="preserve"> при переходе по специальному </w:t>
       </w:r>
       <w:r>
         <w:rPr>
@@ -5439,71 +5584,71 @@
           <w:sz w:val="28"/>
           <w:szCs w:val="32"/>
         </w:rPr>
-        <w:t xml:space="preserve">запросу. При переходе отображается </w:t>
-      </w:r>
-      <w:r>
-        <w:rPr>
-          <w:rFonts w:ascii="Times New Roman" w:hAnsi="Times New Roman" w:cs="Times New Roman"/>
-          <w:sz w:val="28"/>
-          <w:szCs w:val="32"/>
-        </w:rPr>
-        <w:t>главная</w:t>
-      </w:r>
-      <w:r>
-        <w:rPr>
-          <w:rFonts w:ascii="Times New Roman" w:hAnsi="Times New Roman" w:cs="Times New Roman"/>
-          <w:sz w:val="28"/>
-          <w:szCs w:val="32"/>
-        </w:rPr>
-        <w:t xml:space="preserve"> страница </w:t>
-      </w:r>
-      <w:r>
-        <w:rPr>
-          <w:rFonts w:ascii="Times New Roman" w:hAnsi="Times New Roman" w:cs="Times New Roman"/>
-          <w:sz w:val="28"/>
-          <w:szCs w:val="32"/>
-        </w:rPr>
-        <w:t>панели, содержащая</w:t>
-      </w:r>
-      <w:r>
-        <w:rPr>
-          <w:rFonts w:ascii="Times New Roman" w:hAnsi="Times New Roman" w:cs="Times New Roman"/>
-          <w:sz w:val="28"/>
-          <w:szCs w:val="32"/>
-        </w:rPr>
-        <w:t xml:space="preserve"> некоторы</w:t>
-      </w:r>
-      <w:r>
-        <w:rPr>
-          <w:rFonts w:ascii="Times New Roman" w:hAnsi="Times New Roman" w:cs="Times New Roman"/>
-          <w:sz w:val="28"/>
-          <w:szCs w:val="32"/>
-        </w:rPr>
-        <w:t xml:space="preserve">е </w:t>
-      </w:r>
-      <w:r>
-        <w:rPr>
-          <w:rFonts w:ascii="Times New Roman" w:hAnsi="Times New Roman" w:cs="Times New Roman"/>
-          <w:sz w:val="28"/>
-          <w:szCs w:val="32"/>
-        </w:rPr>
-        <w:t>кратк</w:t>
-      </w:r>
-      <w:r>
-        <w:rPr>
-          <w:rFonts w:ascii="Times New Roman" w:hAnsi="Times New Roman" w:cs="Times New Roman"/>
-          <w:sz w:val="28"/>
-          <w:szCs w:val="32"/>
-        </w:rPr>
-        <w:t>ие</w:t>
-      </w:r>
-      <w:r>
-        <w:rPr>
-          <w:rFonts w:ascii="Times New Roman" w:hAnsi="Times New Roman" w:cs="Times New Roman"/>
-          <w:sz w:val="28"/>
-          <w:szCs w:val="32"/>
-        </w:rPr>
-        <w:t xml:space="preserve"> статистически</w:t>
+        <w:t>или при выборе пункта «Статистика» в боковом меню статистические данные могут не загрузиться, что приведет к</w:t>
+      </w:r>
+      <w:r>
+        <w:rPr>
+          <w:rFonts w:ascii="Times New Roman" w:hAnsi="Times New Roman" w:cs="Times New Roman"/>
+          <w:sz w:val="28"/>
+          <w:szCs w:val="32"/>
+        </w:rPr>
+        <w:t xml:space="preserve"> возникновению</w:t>
+      </w:r>
+      <w:r>
+        <w:rPr>
+          <w:rFonts w:ascii="Times New Roman" w:hAnsi="Times New Roman" w:cs="Times New Roman"/>
+          <w:sz w:val="28"/>
+          <w:szCs w:val="32"/>
+        </w:rPr>
+        <w:t xml:space="preserve"> </w:t>
+      </w:r>
+      <w:r>
+        <w:rPr>
+          <w:rFonts w:ascii="Times New Roman" w:hAnsi="Times New Roman" w:cs="Times New Roman"/>
+          <w:sz w:val="28"/>
+          <w:szCs w:val="32"/>
+        </w:rPr>
+        <w:t>ошибки</w:t>
+      </w:r>
+      <w:r>
+        <w:rPr>
+          <w:rFonts w:ascii="Times New Roman" w:hAnsi="Times New Roman" w:cs="Times New Roman"/>
+          <w:sz w:val="28"/>
+          <w:szCs w:val="32"/>
+        </w:rPr>
+        <w:t xml:space="preserve"> и отображению различных </w:t>
+      </w:r>
+      <w:r>
+        <w:rPr>
+          <w:rFonts w:ascii="Times New Roman" w:hAnsi="Times New Roman" w:cs="Times New Roman"/>
+          <w:sz w:val="28"/>
+          <w:szCs w:val="32"/>
+        </w:rPr>
+        <w:t>окон</w:t>
+      </w:r>
+      <w:r>
+        <w:rPr>
+          <w:rFonts w:ascii="Times New Roman" w:hAnsi="Times New Roman" w:cs="Times New Roman"/>
+          <w:sz w:val="28"/>
+          <w:szCs w:val="32"/>
+        </w:rPr>
+        <w:t>, сообщающих о</w:t>
+      </w:r>
+      <w:r>
+        <w:rPr>
+          <w:rFonts w:ascii="Times New Roman" w:hAnsi="Times New Roman" w:cs="Times New Roman"/>
+          <w:sz w:val="28"/>
+          <w:szCs w:val="32"/>
+        </w:rPr>
+        <w:t>б</w:t>
+      </w:r>
+      <w:r>
+        <w:rPr>
+          <w:rFonts w:ascii="Times New Roman" w:hAnsi="Times New Roman" w:cs="Times New Roman"/>
+          <w:sz w:val="28"/>
+          <w:szCs w:val="32"/>
+        </w:rPr>
+        <w:t xml:space="preserve"> ошибк</w:t>
       </w:r>
       <w:r>
         <w:rPr>
@@ -5519,39 +5664,15 @@
           <w:sz w:val="28"/>
           <w:szCs w:val="32"/>
         </w:rPr>
-        <w:t xml:space="preserve"> данны</w:t>
-      </w:r>
-      <w:r>
-        <w:rPr>
-          <w:rFonts w:ascii="Times New Roman" w:hAnsi="Times New Roman" w:cs="Times New Roman"/>
-          <w:sz w:val="28"/>
-          <w:szCs w:val="32"/>
-        </w:rPr>
-        <w:t>е</w:t>
-      </w:r>
-      <w:r>
-        <w:rPr>
-          <w:rFonts w:ascii="Times New Roman" w:hAnsi="Times New Roman" w:cs="Times New Roman"/>
-          <w:sz w:val="28"/>
-          <w:szCs w:val="32"/>
-        </w:rPr>
-        <w:t xml:space="preserve">, например, </w:t>
-      </w:r>
-      <w:r>
-        <w:rPr>
-          <w:rFonts w:ascii="Times New Roman" w:hAnsi="Times New Roman" w:cs="Times New Roman"/>
-          <w:sz w:val="28"/>
-          <w:szCs w:val="32"/>
-        </w:rPr>
-        <w:t xml:space="preserve">показатели </w:t>
-      </w:r>
-      <w:r>
-        <w:rPr>
-          <w:rFonts w:ascii="Times New Roman" w:hAnsi="Times New Roman" w:cs="Times New Roman"/>
-          <w:sz w:val="28"/>
-          <w:szCs w:val="32"/>
-        </w:rPr>
-        <w:t>продажи за определенный период в виде диаграммы.</w:t>
+        <w:t xml:space="preserve">, </w:t>
+      </w:r>
+      <w:r>
+        <w:rPr>
+          <w:rFonts w:ascii="Times New Roman" w:hAnsi="Times New Roman" w:cs="Times New Roman"/>
+          <w:sz w:val="28"/>
+          <w:szCs w:val="32"/>
+        </w:rPr>
+        <w:t>поверх диаграмм.</w:t>
       </w:r>
     </w:p>
     <w:p>
@@ -5571,175 +5692,6 @@
       <w:r>
         <w:rPr>
           <w:rFonts w:ascii="Times New Roman" w:hAnsi="Times New Roman" w:cs="Times New Roman"/>
-          <w:sz w:val="28"/>
-          <w:szCs w:val="32"/>
-        </w:rPr>
-        <w:t xml:space="preserve">В панели управления в боковом меню </w:t>
-      </w:r>
-      <w:r>
-        <w:rPr>
-          <w:rFonts w:ascii="Times New Roman" w:hAnsi="Times New Roman" w:cs="Times New Roman"/>
-          <w:sz w:val="28"/>
-          <w:szCs w:val="32"/>
-        </w:rPr>
-        <w:t xml:space="preserve">сотрудник </w:t>
-      </w:r>
-      <w:r>
-        <w:rPr>
-          <w:rFonts w:ascii="Times New Roman" w:hAnsi="Times New Roman" w:cs="Times New Roman"/>
-          <w:sz w:val="28"/>
-          <w:szCs w:val="32"/>
-        </w:rPr>
-        <w:t>выбирает пункт «Статистика», тем самым попадая на страницу с более детальными статистическим данными и собранными метриками.</w:t>
-      </w:r>
-    </w:p>
-    <w:p>
-      <w:pPr>
-        <w:pStyle w:val="a3"/>
-        <w:spacing w:line="360" w:lineRule="auto"/>
-        <w:ind w:firstLine="709"/>
-        <w:jc w:val="both"/>
-        <w:rPr>
-          <w:rFonts w:ascii="Times New Roman" w:hAnsi="Times New Roman" w:cs="Times New Roman"/>
-          <w:i/>
-          <w:iCs/>
-          <w:sz w:val="28"/>
-          <w:szCs w:val="32"/>
-        </w:rPr>
-      </w:pPr>
-      <w:r>
-        <w:rPr>
-          <w:rFonts w:ascii="Times New Roman" w:hAnsi="Times New Roman" w:cs="Times New Roman"/>
-          <w:i/>
-          <w:iCs/>
-          <w:sz w:val="28"/>
-          <w:szCs w:val="32"/>
-        </w:rPr>
-        <w:t>Альтернативный поток</w:t>
-      </w:r>
-      <w:r>
-        <w:rPr>
-          <w:rFonts w:ascii="Times New Roman" w:hAnsi="Times New Roman" w:cs="Times New Roman"/>
-          <w:sz w:val="28"/>
-          <w:szCs w:val="32"/>
-        </w:rPr>
-        <w:t>:</w:t>
-      </w:r>
-      <w:r>
-        <w:rPr>
-          <w:rFonts w:ascii="Times New Roman" w:hAnsi="Times New Roman" w:cs="Times New Roman"/>
-          <w:sz w:val="28"/>
-          <w:szCs w:val="32"/>
-        </w:rPr>
-        <w:t xml:space="preserve"> при переходе по специальному </w:t>
-      </w:r>
-      <w:r>
-        <w:rPr>
-          <w:rFonts w:ascii="Times New Roman" w:hAnsi="Times New Roman" w:cs="Times New Roman"/>
-          <w:sz w:val="28"/>
-          <w:szCs w:val="32"/>
-          <w:lang w:val="en-US"/>
-        </w:rPr>
-        <w:t>URL</w:t>
-      </w:r>
-      <w:r>
-        <w:rPr>
-          <w:rFonts w:ascii="Times New Roman" w:hAnsi="Times New Roman" w:cs="Times New Roman"/>
-          <w:sz w:val="28"/>
-          <w:szCs w:val="32"/>
-        </w:rPr>
-        <w:t xml:space="preserve"> </w:t>
-      </w:r>
-      <w:r>
-        <w:rPr>
-          <w:rFonts w:ascii="Times New Roman" w:hAnsi="Times New Roman" w:cs="Times New Roman"/>
-          <w:sz w:val="28"/>
-          <w:szCs w:val="32"/>
-        </w:rPr>
-        <w:t>или при выборе пункта «Статистика» в боковом меню статистические данные могут не загрузиться, что приведет к</w:t>
-      </w:r>
-      <w:r>
-        <w:rPr>
-          <w:rFonts w:ascii="Times New Roman" w:hAnsi="Times New Roman" w:cs="Times New Roman"/>
-          <w:sz w:val="28"/>
-          <w:szCs w:val="32"/>
-        </w:rPr>
-        <w:t xml:space="preserve"> возникновению</w:t>
-      </w:r>
-      <w:r>
-        <w:rPr>
-          <w:rFonts w:ascii="Times New Roman" w:hAnsi="Times New Roman" w:cs="Times New Roman"/>
-          <w:sz w:val="28"/>
-          <w:szCs w:val="32"/>
-        </w:rPr>
-        <w:t xml:space="preserve"> </w:t>
-      </w:r>
-      <w:r>
-        <w:rPr>
-          <w:rFonts w:ascii="Times New Roman" w:hAnsi="Times New Roman" w:cs="Times New Roman"/>
-          <w:sz w:val="28"/>
-          <w:szCs w:val="32"/>
-        </w:rPr>
-        <w:t>ошибки</w:t>
-      </w:r>
-      <w:r>
-        <w:rPr>
-          <w:rFonts w:ascii="Times New Roman" w:hAnsi="Times New Roman" w:cs="Times New Roman"/>
-          <w:sz w:val="28"/>
-          <w:szCs w:val="32"/>
-        </w:rPr>
-        <w:t xml:space="preserve"> и отображению различных меню</w:t>
-      </w:r>
-      <w:r>
-        <w:rPr>
-          <w:rFonts w:ascii="Times New Roman" w:hAnsi="Times New Roman" w:cs="Times New Roman"/>
-          <w:sz w:val="28"/>
-          <w:szCs w:val="32"/>
-        </w:rPr>
-        <w:t>, сообщающих о</w:t>
-      </w:r>
-      <w:r>
-        <w:rPr>
-          <w:rFonts w:ascii="Times New Roman" w:hAnsi="Times New Roman" w:cs="Times New Roman"/>
-          <w:sz w:val="28"/>
-          <w:szCs w:val="32"/>
-        </w:rPr>
-        <w:t>б</w:t>
-      </w:r>
-      <w:r>
-        <w:rPr>
-          <w:rFonts w:ascii="Times New Roman" w:hAnsi="Times New Roman" w:cs="Times New Roman"/>
-          <w:sz w:val="28"/>
-          <w:szCs w:val="32"/>
-        </w:rPr>
-        <w:t xml:space="preserve"> ошибки, </w:t>
-      </w:r>
-      <w:r>
-        <w:rPr>
-          <w:rFonts w:ascii="Times New Roman" w:hAnsi="Times New Roman" w:cs="Times New Roman"/>
-          <w:sz w:val="28"/>
-          <w:szCs w:val="32"/>
-        </w:rPr>
-        <w:t>поверх диаграмм.</w:t>
-      </w:r>
-    </w:p>
-    <w:p>
-      <w:pPr>
-        <w:pStyle w:val="a3"/>
-        <w:spacing w:line="360" w:lineRule="auto"/>
-        <w:ind w:firstLine="709"/>
-        <w:jc w:val="both"/>
-        <w:rPr>
-          <w:rFonts w:ascii="Times New Roman" w:hAnsi="Times New Roman" w:cs="Times New Roman"/>
-          <w:i/>
-          <w:iCs/>
-          <w:sz w:val="28"/>
-          <w:szCs w:val="32"/>
-        </w:rPr>
-      </w:pPr>
-      <w:r>
-        <w:rPr>
-          <w:rFonts w:ascii="Times New Roman" w:hAnsi="Times New Roman" w:cs="Times New Roman"/>
           <w:i/>
           <w:iCs/>
           <w:sz w:val="28"/>
@@ -5781,7 +5733,6 @@
           <w:sz w:val="28"/>
           <w:szCs w:val="28"/>
         </w:rPr>
-        <w:lastRenderedPageBreak/>
         <w:drawing>
           <wp:inline distT="0" distB="0" distL="0" distR="0" wp14:anchorId="68993107" wp14:editId="5EC7EFAC">
             <wp:extent cx="6118860" cy="4320540"/>
@@ -5924,39 +5875,6 @@
     </w:p>
     <w:p>
       <w:pPr>
-        <w:rPr>
-          <w:rFonts w:cs="Times New Roman"/>
-          <w:b/>
-          <w:bCs/>
-          <w:szCs w:val="28"/>
-        </w:rPr>
-      </w:pPr>
-      <w:r>
-        <w:rPr>
-          <w:rFonts w:cs="Times New Roman"/>
-          <w:szCs w:val="28"/>
-        </w:rPr>
-        <w:t>2.2</w:t>
-      </w:r>
-      <w:r>
-        <w:rPr>
-          <w:rFonts w:cs="Times New Roman"/>
-          <w:szCs w:val="28"/>
-        </w:rPr>
-        <w:tab/>
-        <w:t>Моделирование структуры ПС на верхнем уровне</w:t>
-      </w:r>
-    </w:p>
-    <w:p>
-      <w:pPr>
-        <w:rPr>
-          <w:rFonts w:cs="Times New Roman"/>
-          <w:szCs w:val="28"/>
-        </w:rPr>
-      </w:pPr>
-    </w:p>
-    <w:p>
-      <w:pPr>
         <w:pStyle w:val="a3"/>
         <w:spacing w:line="360" w:lineRule="auto"/>
         <w:ind w:firstLine="709"/>
@@ -5967,6 +5885,53 @@
           <w:szCs w:val="32"/>
         </w:rPr>
       </w:pPr>
+    </w:p>
+    <w:p>
+      <w:pPr>
+        <w:rPr>
+          <w:rFonts w:cs="Times New Roman"/>
+          <w:b/>
+          <w:bCs/>
+          <w:szCs w:val="28"/>
+        </w:rPr>
+      </w:pPr>
+      <w:r>
+        <w:rPr>
+          <w:rFonts w:cs="Times New Roman"/>
+          <w:szCs w:val="28"/>
+        </w:rPr>
+        <w:lastRenderedPageBreak/>
+        <w:t>2.2</w:t>
+      </w:r>
+      <w:r>
+        <w:rPr>
+          <w:rFonts w:cs="Times New Roman"/>
+          <w:szCs w:val="28"/>
+        </w:rPr>
+        <w:tab/>
+        <w:t>Моделирование структуры ПС на верхнем уровне</w:t>
+      </w:r>
+    </w:p>
+    <w:p>
+      <w:pPr>
+        <w:rPr>
+          <w:rFonts w:cs="Times New Roman"/>
+          <w:szCs w:val="28"/>
+        </w:rPr>
+      </w:pPr>
+    </w:p>
+    <w:p>
+      <w:pPr>
+        <w:pStyle w:val="a3"/>
+        <w:spacing w:line="360" w:lineRule="auto"/>
+        <w:ind w:firstLine="709"/>
+        <w:jc w:val="both"/>
+        <w:rPr>
+          <w:rFonts w:ascii="Times New Roman" w:hAnsi="Times New Roman" w:cs="Times New Roman"/>
+          <w:sz w:val="28"/>
+          <w:szCs w:val="32"/>
+        </w:rPr>
+      </w:pPr>
       <w:r>
         <w:rPr>
           <w:rFonts w:ascii="Times New Roman" w:hAnsi="Times New Roman" w:cs="Times New Roman"/>
@@ -6015,7 +5980,6 @@
           <w:noProof/>
           <w:szCs w:val="28"/>
         </w:rPr>
-        <w:lastRenderedPageBreak/>
         <w:drawing>
           <wp:inline distT="0" distB="0" distL="0" distR="0" wp14:anchorId="0B2B9AA6" wp14:editId="041D7347">
             <wp:extent cx="6120130" cy="4020185"/>
@@ -6146,8 +6110,999 @@
         </w:rPr>
       </w:pPr>
     </w:p>
+    <w:p>
+      <w:pPr>
+        <w:rPr>
+          <w:rFonts w:cs="Times New Roman"/>
+          <w:szCs w:val="28"/>
+        </w:rPr>
+      </w:pPr>
+      <w:r>
+        <w:rPr>
+          <w:rFonts w:cs="Times New Roman"/>
+          <w:szCs w:val="28"/>
+        </w:rPr>
+        <w:t>2.</w:t>
+      </w:r>
+      <w:r>
+        <w:rPr>
+          <w:rFonts w:cs="Times New Roman"/>
+          <w:szCs w:val="28"/>
+        </w:rPr>
+        <w:t>3</w:t>
+      </w:r>
+      <w:r>
+        <w:rPr>
+          <w:rFonts w:cs="Times New Roman"/>
+          <w:szCs w:val="28"/>
+        </w:rPr>
+        <w:tab/>
+      </w:r>
+      <w:r>
+        <w:rPr>
+          <w:rFonts w:cs="Times New Roman"/>
+          <w:szCs w:val="28"/>
+        </w:rPr>
+        <w:t>Моделирование состояний объекта ПС.</w:t>
+      </w:r>
+    </w:p>
+    <w:p>
+      <w:pPr>
+        <w:rPr>
+          <w:rFonts w:cs="Times New Roman"/>
+          <w:szCs w:val="28"/>
+        </w:rPr>
+      </w:pPr>
+    </w:p>
+    <w:p>
+      <w:pPr>
+        <w:pStyle w:val="a3"/>
+        <w:spacing w:line="360" w:lineRule="auto"/>
+        <w:ind w:firstLine="709"/>
+        <w:jc w:val="both"/>
+        <w:rPr>
+          <w:rFonts w:ascii="Times New Roman" w:hAnsi="Times New Roman" w:cs="Times New Roman"/>
+          <w:sz w:val="28"/>
+          <w:szCs w:val="32"/>
+        </w:rPr>
+      </w:pPr>
+      <w:r>
+        <w:rPr>
+          <w:rFonts w:ascii="Times New Roman" w:hAnsi="Times New Roman" w:cs="Times New Roman"/>
+          <w:sz w:val="28"/>
+          <w:szCs w:val="32"/>
+        </w:rPr>
+        <w:t xml:space="preserve">Ключевой сущностью в </w:t>
+      </w:r>
+      <w:r>
+        <w:rPr>
+          <w:rFonts w:ascii="Times New Roman" w:hAnsi="Times New Roman" w:cs="Times New Roman"/>
+          <w:sz w:val="28"/>
+          <w:szCs w:val="32"/>
+        </w:rPr>
+        <w:t xml:space="preserve">подсистеме «Каталог» </w:t>
+      </w:r>
+      <w:r>
+        <w:rPr>
+          <w:rFonts w:ascii="Times New Roman" w:hAnsi="Times New Roman" w:cs="Times New Roman"/>
+          <w:sz w:val="28"/>
+          <w:szCs w:val="32"/>
+        </w:rPr>
+        <w:t>является объект «</w:t>
+      </w:r>
+      <w:r>
+        <w:rPr>
+          <w:rFonts w:ascii="Times New Roman" w:hAnsi="Times New Roman" w:cs="Times New Roman"/>
+          <w:sz w:val="28"/>
+          <w:szCs w:val="32"/>
+        </w:rPr>
+        <w:t>Продукт</w:t>
+      </w:r>
+      <w:r>
+        <w:rPr>
+          <w:rFonts w:ascii="Times New Roman" w:hAnsi="Times New Roman" w:cs="Times New Roman"/>
+          <w:sz w:val="28"/>
+          <w:szCs w:val="32"/>
+        </w:rPr>
+        <w:t>». Его жизненный цикл</w:t>
+      </w:r>
+      <w:r>
+        <w:rPr>
+          <w:rFonts w:ascii="Times New Roman" w:hAnsi="Times New Roman" w:cs="Times New Roman"/>
+          <w:sz w:val="28"/>
+          <w:szCs w:val="32"/>
+        </w:rPr>
+        <w:t xml:space="preserve"> </w:t>
+      </w:r>
+      <w:r>
+        <w:rPr>
+          <w:rFonts w:ascii="Times New Roman" w:hAnsi="Times New Roman" w:cs="Times New Roman"/>
+          <w:sz w:val="28"/>
+          <w:szCs w:val="32"/>
+        </w:rPr>
+        <w:t xml:space="preserve">был </w:t>
+      </w:r>
+      <w:proofErr w:type="spellStart"/>
+      <w:r>
+        <w:rPr>
+          <w:rFonts w:ascii="Times New Roman" w:hAnsi="Times New Roman" w:cs="Times New Roman"/>
+          <w:sz w:val="28"/>
+          <w:szCs w:val="32"/>
+        </w:rPr>
+        <w:t>отображен</w:t>
+      </w:r>
+      <w:proofErr w:type="spellEnd"/>
+      <w:r>
+        <w:rPr>
+          <w:rFonts w:ascii="Times New Roman" w:hAnsi="Times New Roman" w:cs="Times New Roman"/>
+          <w:sz w:val="28"/>
+          <w:szCs w:val="32"/>
+        </w:rPr>
+        <w:t xml:space="preserve"> при помощи диаграммы состояний – «</w:t>
+      </w:r>
+      <w:proofErr w:type="spellStart"/>
+      <w:r>
+        <w:rPr>
+          <w:rFonts w:ascii="Times New Roman" w:hAnsi="Times New Roman" w:cs="Times New Roman"/>
+          <w:sz w:val="28"/>
+          <w:szCs w:val="32"/>
+        </w:rPr>
+        <w:t>Statechart</w:t>
+      </w:r>
+      <w:proofErr w:type="spellEnd"/>
+      <w:r>
+        <w:rPr>
+          <w:rFonts w:ascii="Times New Roman" w:hAnsi="Times New Roman" w:cs="Times New Roman"/>
+          <w:sz w:val="28"/>
+          <w:szCs w:val="32"/>
+        </w:rPr>
+        <w:t xml:space="preserve"> </w:t>
+      </w:r>
+      <w:proofErr w:type="spellStart"/>
+      <w:r>
+        <w:rPr>
+          <w:rFonts w:ascii="Times New Roman" w:hAnsi="Times New Roman" w:cs="Times New Roman"/>
+          <w:sz w:val="28"/>
+          <w:szCs w:val="32"/>
+        </w:rPr>
+        <w:t>Diagram</w:t>
+      </w:r>
+      <w:proofErr w:type="spellEnd"/>
+      <w:r>
+        <w:rPr>
+          <w:rFonts w:ascii="Times New Roman" w:hAnsi="Times New Roman" w:cs="Times New Roman"/>
+          <w:sz w:val="28"/>
+          <w:szCs w:val="32"/>
+        </w:rPr>
+        <w:t>», представленной на рисунке 3.</w:t>
+      </w:r>
+    </w:p>
+    <w:p>
+      <w:pPr>
+        <w:pStyle w:val="a3"/>
+        <w:spacing w:line="360" w:lineRule="auto"/>
+        <w:ind w:firstLine="709"/>
+        <w:jc w:val="both"/>
+        <w:rPr>
+          <w:rFonts w:ascii="Times New Roman" w:hAnsi="Times New Roman" w:cs="Times New Roman"/>
+          <w:sz w:val="28"/>
+          <w:szCs w:val="32"/>
+        </w:rPr>
+      </w:pPr>
+      <w:r>
+        <w:rPr>
+          <w:rFonts w:ascii="Times New Roman" w:hAnsi="Times New Roman" w:cs="Times New Roman"/>
+          <w:sz w:val="28"/>
+          <w:szCs w:val="32"/>
+        </w:rPr>
+        <w:lastRenderedPageBreak/>
+        <w:t xml:space="preserve">Диаграмма </w:t>
+      </w:r>
+      <w:r>
+        <w:rPr>
+          <w:rFonts w:ascii="Times New Roman" w:hAnsi="Times New Roman" w:cs="Times New Roman"/>
+          <w:sz w:val="28"/>
+          <w:szCs w:val="32"/>
+        </w:rPr>
+        <w:t>отражает</w:t>
+      </w:r>
+      <w:r>
+        <w:rPr>
+          <w:rFonts w:ascii="Times New Roman" w:hAnsi="Times New Roman" w:cs="Times New Roman"/>
+          <w:sz w:val="28"/>
+          <w:szCs w:val="32"/>
+        </w:rPr>
+        <w:t xml:space="preserve"> последовательность смены статусов</w:t>
+      </w:r>
+      <w:r>
+        <w:rPr>
+          <w:rFonts w:ascii="Times New Roman" w:hAnsi="Times New Roman" w:cs="Times New Roman"/>
+          <w:sz w:val="28"/>
+          <w:szCs w:val="32"/>
+        </w:rPr>
+        <w:t xml:space="preserve"> наличия</w:t>
+      </w:r>
+      <w:r>
+        <w:rPr>
+          <w:rFonts w:ascii="Times New Roman" w:hAnsi="Times New Roman" w:cs="Times New Roman"/>
+          <w:sz w:val="28"/>
+          <w:szCs w:val="32"/>
+        </w:rPr>
+        <w:t xml:space="preserve"> </w:t>
+      </w:r>
+      <w:r>
+        <w:rPr>
+          <w:rFonts w:ascii="Times New Roman" w:hAnsi="Times New Roman" w:cs="Times New Roman"/>
+          <w:sz w:val="28"/>
+          <w:szCs w:val="32"/>
+        </w:rPr>
+        <w:t>продукта</w:t>
+      </w:r>
+      <w:r>
+        <w:rPr>
+          <w:rFonts w:ascii="Times New Roman" w:hAnsi="Times New Roman" w:cs="Times New Roman"/>
+          <w:sz w:val="28"/>
+          <w:szCs w:val="32"/>
+        </w:rPr>
+        <w:t xml:space="preserve"> с </w:t>
+      </w:r>
+      <w:r>
+        <w:rPr>
+          <w:rFonts w:ascii="Times New Roman" w:hAnsi="Times New Roman" w:cs="Times New Roman"/>
+          <w:sz w:val="28"/>
+          <w:szCs w:val="32"/>
+        </w:rPr>
+        <w:t xml:space="preserve">момента </w:t>
+      </w:r>
+      <w:r>
+        <w:rPr>
+          <w:rFonts w:ascii="Times New Roman" w:hAnsi="Times New Roman" w:cs="Times New Roman"/>
+          <w:sz w:val="28"/>
+          <w:szCs w:val="32"/>
+        </w:rPr>
+        <w:t xml:space="preserve">его </w:t>
+      </w:r>
+      <w:r>
+        <w:rPr>
+          <w:rFonts w:ascii="Times New Roman" w:hAnsi="Times New Roman" w:cs="Times New Roman"/>
+          <w:sz w:val="28"/>
+          <w:szCs w:val="32"/>
+        </w:rPr>
+        <w:t xml:space="preserve">создания </w:t>
+      </w:r>
+      <w:r>
+        <w:rPr>
+          <w:rFonts w:ascii="Times New Roman" w:hAnsi="Times New Roman" w:cs="Times New Roman"/>
+          <w:sz w:val="28"/>
+          <w:szCs w:val="32"/>
+        </w:rPr>
+        <w:t xml:space="preserve">до </w:t>
+      </w:r>
+      <w:r>
+        <w:rPr>
+          <w:rFonts w:ascii="Times New Roman" w:hAnsi="Times New Roman" w:cs="Times New Roman"/>
+          <w:sz w:val="28"/>
+          <w:szCs w:val="32"/>
+        </w:rPr>
+        <w:t>удаления из программной системы</w:t>
+      </w:r>
+      <w:r>
+        <w:rPr>
+          <w:rFonts w:ascii="Times New Roman" w:hAnsi="Times New Roman" w:cs="Times New Roman"/>
+          <w:sz w:val="28"/>
+          <w:szCs w:val="32"/>
+        </w:rPr>
+        <w:t>.</w:t>
+      </w:r>
+      <w:r>
+        <w:rPr>
+          <w:rFonts w:ascii="Times New Roman" w:hAnsi="Times New Roman" w:cs="Times New Roman"/>
+          <w:sz w:val="28"/>
+          <w:szCs w:val="32"/>
+        </w:rPr>
+        <w:t xml:space="preserve"> Состояние продукта включает в себя следующие состояния</w:t>
+      </w:r>
+      <w:r>
+        <w:rPr>
+          <w:rFonts w:ascii="Times New Roman" w:hAnsi="Times New Roman" w:cs="Times New Roman"/>
+          <w:sz w:val="28"/>
+          <w:szCs w:val="32"/>
+        </w:rPr>
+        <w:t xml:space="preserve">: «Создан» – </w:t>
+      </w:r>
+      <w:r>
+        <w:rPr>
+          <w:rFonts w:ascii="Times New Roman" w:hAnsi="Times New Roman" w:cs="Times New Roman"/>
+          <w:sz w:val="28"/>
+          <w:szCs w:val="32"/>
+        </w:rPr>
+        <w:t xml:space="preserve">работник магазина </w:t>
+      </w:r>
+      <w:proofErr w:type="spellStart"/>
+      <w:r>
+        <w:rPr>
+          <w:rFonts w:ascii="Times New Roman" w:hAnsi="Times New Roman" w:cs="Times New Roman"/>
+          <w:sz w:val="28"/>
+          <w:szCs w:val="32"/>
+        </w:rPr>
+        <w:t>создает</w:t>
+      </w:r>
+      <w:proofErr w:type="spellEnd"/>
+      <w:r>
+        <w:rPr>
+          <w:rFonts w:ascii="Times New Roman" w:hAnsi="Times New Roman" w:cs="Times New Roman"/>
+          <w:sz w:val="28"/>
+          <w:szCs w:val="32"/>
+        </w:rPr>
+        <w:t xml:space="preserve"> новый товар в системе</w:t>
+      </w:r>
+      <w:r>
+        <w:rPr>
+          <w:rFonts w:ascii="Times New Roman" w:hAnsi="Times New Roman" w:cs="Times New Roman"/>
+          <w:sz w:val="28"/>
+          <w:szCs w:val="32"/>
+        </w:rPr>
+        <w:t>; «</w:t>
+      </w:r>
+      <w:r>
+        <w:rPr>
+          <w:rFonts w:ascii="Times New Roman" w:hAnsi="Times New Roman" w:cs="Times New Roman"/>
+          <w:sz w:val="28"/>
+          <w:szCs w:val="32"/>
+        </w:rPr>
+        <w:t>Доступен</w:t>
+      </w:r>
+      <w:r>
+        <w:rPr>
+          <w:rFonts w:ascii="Times New Roman" w:hAnsi="Times New Roman" w:cs="Times New Roman"/>
+          <w:sz w:val="28"/>
+          <w:szCs w:val="32"/>
+        </w:rPr>
+        <w:t xml:space="preserve">» – </w:t>
+      </w:r>
+      <w:r>
+        <w:rPr>
+          <w:rFonts w:ascii="Times New Roman" w:hAnsi="Times New Roman" w:cs="Times New Roman"/>
+          <w:sz w:val="28"/>
+          <w:szCs w:val="32"/>
+        </w:rPr>
+        <w:t>количество товара на складе пополн</w:t>
+      </w:r>
+      <w:r>
+        <w:rPr>
+          <w:rFonts w:ascii="Times New Roman" w:hAnsi="Times New Roman" w:cs="Times New Roman"/>
+          <w:sz w:val="28"/>
+          <w:szCs w:val="32"/>
+        </w:rPr>
+        <w:t>яется</w:t>
+      </w:r>
+      <w:r>
+        <w:rPr>
+          <w:rFonts w:ascii="Times New Roman" w:hAnsi="Times New Roman" w:cs="Times New Roman"/>
+          <w:sz w:val="28"/>
+          <w:szCs w:val="32"/>
+        </w:rPr>
+        <w:t xml:space="preserve"> новой поставкой </w:t>
+      </w:r>
+      <w:r>
+        <w:rPr>
+          <w:rFonts w:ascii="Times New Roman" w:hAnsi="Times New Roman" w:cs="Times New Roman"/>
+          <w:sz w:val="28"/>
+          <w:szCs w:val="32"/>
+        </w:rPr>
+        <w:t xml:space="preserve">равняется </w:t>
+      </w:r>
+      <w:r>
+        <w:rPr>
+          <w:rFonts w:ascii="Times New Roman" w:hAnsi="Times New Roman" w:cs="Times New Roman"/>
+          <w:sz w:val="28"/>
+          <w:szCs w:val="32"/>
+        </w:rPr>
+        <w:t>положительному числу</w:t>
+      </w:r>
+      <w:r>
+        <w:rPr>
+          <w:rFonts w:ascii="Times New Roman" w:hAnsi="Times New Roman" w:cs="Times New Roman"/>
+          <w:sz w:val="28"/>
+          <w:szCs w:val="32"/>
+        </w:rPr>
+        <w:t>; «</w:t>
+      </w:r>
+      <w:r>
+        <w:rPr>
+          <w:rFonts w:ascii="Times New Roman" w:hAnsi="Times New Roman" w:cs="Times New Roman"/>
+          <w:sz w:val="28"/>
+          <w:szCs w:val="32"/>
+        </w:rPr>
+        <w:t>Нет в наличии</w:t>
+      </w:r>
+      <w:r>
+        <w:rPr>
+          <w:rFonts w:ascii="Times New Roman" w:hAnsi="Times New Roman" w:cs="Times New Roman"/>
+          <w:sz w:val="28"/>
+          <w:szCs w:val="32"/>
+        </w:rPr>
+        <w:t xml:space="preserve">» – </w:t>
+      </w:r>
+      <w:r>
+        <w:rPr>
+          <w:rFonts w:ascii="Times New Roman" w:hAnsi="Times New Roman" w:cs="Times New Roman"/>
+          <w:sz w:val="28"/>
+          <w:szCs w:val="32"/>
+        </w:rPr>
+        <w:t>все товары на складе распроданы и недоступны для приобретения</w:t>
+      </w:r>
+      <w:r>
+        <w:rPr>
+          <w:rFonts w:ascii="Times New Roman" w:hAnsi="Times New Roman" w:cs="Times New Roman"/>
+          <w:sz w:val="28"/>
+          <w:szCs w:val="32"/>
+        </w:rPr>
+        <w:t>; «</w:t>
+      </w:r>
+      <w:proofErr w:type="spellStart"/>
+      <w:r>
+        <w:rPr>
+          <w:rFonts w:ascii="Times New Roman" w:hAnsi="Times New Roman" w:cs="Times New Roman"/>
+          <w:sz w:val="28"/>
+          <w:szCs w:val="32"/>
+        </w:rPr>
+        <w:t>Удален</w:t>
+      </w:r>
+      <w:proofErr w:type="spellEnd"/>
+      <w:r>
+        <w:rPr>
+          <w:rFonts w:ascii="Times New Roman" w:hAnsi="Times New Roman" w:cs="Times New Roman"/>
+          <w:sz w:val="28"/>
+          <w:szCs w:val="32"/>
+        </w:rPr>
+        <w:t xml:space="preserve">» – </w:t>
+      </w:r>
+      <w:r>
+        <w:rPr>
+          <w:rFonts w:ascii="Times New Roman" w:hAnsi="Times New Roman" w:cs="Times New Roman"/>
+          <w:sz w:val="28"/>
+          <w:szCs w:val="32"/>
+        </w:rPr>
+        <w:t xml:space="preserve">продукт </w:t>
+      </w:r>
+      <w:proofErr w:type="spellStart"/>
+      <w:r>
+        <w:rPr>
+          <w:rFonts w:ascii="Times New Roman" w:hAnsi="Times New Roman" w:cs="Times New Roman"/>
+          <w:sz w:val="28"/>
+          <w:szCs w:val="32"/>
+        </w:rPr>
+        <w:t>удален</w:t>
+      </w:r>
+      <w:proofErr w:type="spellEnd"/>
+      <w:r>
+        <w:rPr>
+          <w:rFonts w:ascii="Times New Roman" w:hAnsi="Times New Roman" w:cs="Times New Roman"/>
+          <w:sz w:val="28"/>
+          <w:szCs w:val="32"/>
+        </w:rPr>
+        <w:t xml:space="preserve"> из системы работником магазина</w:t>
+      </w:r>
+      <w:r>
+        <w:rPr>
+          <w:rFonts w:ascii="Times New Roman" w:hAnsi="Times New Roman" w:cs="Times New Roman"/>
+          <w:sz w:val="28"/>
+          <w:szCs w:val="32"/>
+        </w:rPr>
+        <w:t xml:space="preserve"> из-за его вывода из </w:t>
+      </w:r>
+      <w:r>
+        <w:rPr>
+          <w:rFonts w:ascii="Times New Roman" w:hAnsi="Times New Roman" w:cs="Times New Roman"/>
+          <w:sz w:val="28"/>
+          <w:szCs w:val="32"/>
+        </w:rPr>
+        <w:t>продажи</w:t>
+      </w:r>
+      <w:r>
+        <w:rPr>
+          <w:rFonts w:ascii="Times New Roman" w:hAnsi="Times New Roman" w:cs="Times New Roman"/>
+          <w:sz w:val="28"/>
+          <w:szCs w:val="32"/>
+        </w:rPr>
+        <w:t>.</w:t>
+      </w:r>
+    </w:p>
+    <w:p>
+      <w:pPr>
+        <w:pStyle w:val="a3"/>
+        <w:spacing w:line="360" w:lineRule="auto"/>
+        <w:rPr>
+          <w:rFonts w:ascii="Times New Roman" w:hAnsi="Times New Roman" w:cs="Times New Roman"/>
+          <w:sz w:val="28"/>
+          <w:szCs w:val="32"/>
+        </w:rPr>
+      </w:pPr>
+      <w:r>
+        <w:rPr>
+          <w:rFonts w:ascii="Times New Roman" w:hAnsi="Times New Roman" w:cs="Times New Roman"/>
+          <w:sz w:val="28"/>
+          <w:szCs w:val="32"/>
+        </w:rPr>
+        <w:drawing>
+          <wp:inline distT="0" distB="0" distL="0" distR="0" wp14:anchorId="1696D803" wp14:editId="679DE32D">
+            <wp:extent cx="3978647" cy="4434840"/>
+            <wp:effectExtent l="0" t="0" r="3175" b="3810"/>
+            <wp:docPr id="6" name="Рисунок 6"/>
+            <wp:cNvGraphicFramePr>
+              <a:graphicFrameLocks xmlns:a="http://schemas.openxmlformats.org/drawingml/2006/main" noChangeAspect="1"/>
+            </wp:cNvGraphicFramePr>
+            <a:graphic xmlns:a="http://schemas.openxmlformats.org/drawingml/2006/main">
+              <a:graphicData uri="http://schemas.openxmlformats.org/drawingml/2006/picture">
+                <pic:pic xmlns:pic="http://schemas.openxmlformats.org/drawingml/2006/picture">
+                  <pic:nvPicPr>
+                    <pic:cNvPr id="1" name=""/>
+                    <pic:cNvPicPr/>
+                  </pic:nvPicPr>
+                  <pic:blipFill rotWithShape="1">
+                    <a:blip r:embed="rId11"/>
+                    <a:srcRect l="3754" r="4093"/>
+                    <a:stretch/>
+                  </pic:blipFill>
+                  <pic:spPr bwMode="auto">
+                    <a:xfrm>
+                      <a:off x="0" y="0"/>
+                      <a:ext cx="3993805" cy="4451736"/>
+                    </a:xfrm>
+                    <a:prstGeom prst="rect">
+                      <a:avLst/>
+                    </a:prstGeom>
+                    <a:ln>
+                      <a:noFill/>
+                    </a:ln>
+                    <a:extLst>
+                      <a:ext uri="{53640926-AAD7-44D8-BBD7-CCE9431645EC}">
+                        <a14:shadowObscured xmlns:a14="http://schemas.microsoft.com/office/drawing/2010/main"/>
+                      </a:ext>
+                    </a:extLst>
+                  </pic:spPr>
+                </pic:pic>
+              </a:graphicData>
+            </a:graphic>
+          </wp:inline>
+        </w:drawing>
+      </w:r>
+    </w:p>
+    <w:p>
+      <w:pPr>
+        <w:pStyle w:val="a3"/>
+        <w:spacing w:line="360" w:lineRule="auto"/>
+        <w:rPr>
+          <w:rFonts w:ascii="Times New Roman" w:hAnsi="Times New Roman" w:cs="Times New Roman"/>
+          <w:sz w:val="28"/>
+          <w:szCs w:val="32"/>
+        </w:rPr>
+      </w:pPr>
+      <w:r>
+        <w:rPr>
+          <w:rFonts w:ascii="Times New Roman" w:hAnsi="Times New Roman" w:cs="Times New Roman"/>
+          <w:sz w:val="28"/>
+          <w:szCs w:val="32"/>
+        </w:rPr>
+        <w:t>Рисунок 3 – Диаграмма состояний (</w:t>
+      </w:r>
+      <w:proofErr w:type="spellStart"/>
+      <w:r>
+        <w:rPr>
+          <w:rFonts w:ascii="Times New Roman" w:hAnsi="Times New Roman" w:cs="Times New Roman"/>
+          <w:sz w:val="28"/>
+          <w:szCs w:val="32"/>
+        </w:rPr>
+        <w:t>Statechart</w:t>
+      </w:r>
+      <w:proofErr w:type="spellEnd"/>
+      <w:r>
+        <w:rPr>
+          <w:rFonts w:ascii="Times New Roman" w:hAnsi="Times New Roman" w:cs="Times New Roman"/>
+          <w:sz w:val="28"/>
+          <w:szCs w:val="32"/>
+        </w:rPr>
+        <w:t xml:space="preserve"> </w:t>
+      </w:r>
+      <w:proofErr w:type="spellStart"/>
+      <w:r>
+        <w:rPr>
+          <w:rFonts w:ascii="Times New Roman" w:hAnsi="Times New Roman" w:cs="Times New Roman"/>
+          <w:sz w:val="28"/>
+          <w:szCs w:val="32"/>
+        </w:rPr>
+        <w:t>Diagram</w:t>
+      </w:r>
+      <w:proofErr w:type="spellEnd"/>
+      <w:r>
+        <w:rPr>
+          <w:rFonts w:ascii="Times New Roman" w:hAnsi="Times New Roman" w:cs="Times New Roman"/>
+          <w:sz w:val="28"/>
+          <w:szCs w:val="32"/>
+        </w:rPr>
+        <w:t>).</w:t>
+      </w:r>
+    </w:p>
+    <w:p>
+      <w:pPr>
+        <w:pStyle w:val="a3"/>
+        <w:spacing w:line="360" w:lineRule="auto"/>
+        <w:ind w:firstLine="709"/>
+        <w:jc w:val="both"/>
+        <w:rPr>
+          <w:rFonts w:ascii="Times New Roman" w:hAnsi="Times New Roman" w:cs="Times New Roman"/>
+          <w:sz w:val="28"/>
+          <w:szCs w:val="32"/>
+        </w:rPr>
+      </w:pPr>
+    </w:p>
+    <w:p>
+      <w:pPr>
+        <w:rPr>
+          <w:rFonts w:cs="Times New Roman"/>
+          <w:b/>
+          <w:bCs/>
+          <w:szCs w:val="28"/>
+        </w:rPr>
+      </w:pPr>
+      <w:r>
+        <w:rPr>
+          <w:rFonts w:cs="Times New Roman"/>
+          <w:szCs w:val="28"/>
+        </w:rPr>
+        <w:t>2.</w:t>
+      </w:r>
+      <w:r>
+        <w:rPr>
+          <w:rFonts w:cs="Times New Roman"/>
+          <w:szCs w:val="28"/>
+        </w:rPr>
+        <w:t>4</w:t>
+      </w:r>
+      <w:r>
+        <w:rPr>
+          <w:rFonts w:cs="Times New Roman"/>
+          <w:szCs w:val="28"/>
+        </w:rPr>
+        <w:tab/>
+        <w:t>Моделирование структуры ПС на верхнем уровне</w:t>
+      </w:r>
+    </w:p>
+    <w:p>
+      <w:pPr>
+        <w:pStyle w:val="a3"/>
+        <w:spacing w:line="360" w:lineRule="auto"/>
+        <w:ind w:firstLine="709"/>
+        <w:jc w:val="both"/>
+        <w:rPr>
+          <w:rFonts w:ascii="Times New Roman" w:hAnsi="Times New Roman" w:cs="Times New Roman"/>
+          <w:sz w:val="28"/>
+          <w:szCs w:val="32"/>
+        </w:rPr>
+      </w:pPr>
+      <w:r>
+        <w:rPr>
+          <w:rFonts w:ascii="Times New Roman" w:hAnsi="Times New Roman" w:cs="Times New Roman"/>
+          <w:sz w:val="28"/>
+          <w:szCs w:val="32"/>
+        </w:rPr>
+        <w:t>Была разработана диаграмма последовательностей (</w:t>
+      </w:r>
+      <w:r>
+        <w:rPr>
+          <w:rFonts w:ascii="Times New Roman" w:hAnsi="Times New Roman" w:cs="Times New Roman"/>
+          <w:sz w:val="28"/>
+          <w:szCs w:val="32"/>
+        </w:rPr>
+        <w:t>«</w:t>
+      </w:r>
+      <w:proofErr w:type="spellStart"/>
+      <w:r>
+        <w:rPr>
+          <w:rFonts w:ascii="Times New Roman" w:hAnsi="Times New Roman" w:cs="Times New Roman"/>
+          <w:sz w:val="28"/>
+          <w:szCs w:val="32"/>
+        </w:rPr>
+        <w:t>Sequence</w:t>
+      </w:r>
+      <w:proofErr w:type="spellEnd"/>
+      <w:r>
+        <w:rPr>
+          <w:rFonts w:ascii="Times New Roman" w:hAnsi="Times New Roman" w:cs="Times New Roman"/>
+          <w:sz w:val="28"/>
+          <w:szCs w:val="32"/>
+        </w:rPr>
+        <w:t xml:space="preserve"> </w:t>
+      </w:r>
+      <w:proofErr w:type="spellStart"/>
+      <w:r>
+        <w:rPr>
+          <w:rFonts w:ascii="Times New Roman" w:hAnsi="Times New Roman" w:cs="Times New Roman"/>
+          <w:sz w:val="28"/>
+          <w:szCs w:val="32"/>
+        </w:rPr>
+        <w:t>Diagram</w:t>
+      </w:r>
+      <w:proofErr w:type="spellEnd"/>
+      <w:r>
+        <w:rPr>
+          <w:rFonts w:ascii="Times New Roman" w:hAnsi="Times New Roman" w:cs="Times New Roman"/>
+          <w:sz w:val="28"/>
+          <w:szCs w:val="32"/>
+        </w:rPr>
+        <w:t>») для подробного описания процесса обновления информации о товаре.</w:t>
+      </w:r>
+      <w:r>
+        <w:rPr>
+          <w:rFonts w:ascii="Times New Roman" w:hAnsi="Times New Roman" w:cs="Times New Roman"/>
+          <w:sz w:val="28"/>
+          <w:szCs w:val="32"/>
+        </w:rPr>
+        <w:t xml:space="preserve"> С диаграммой можно ознакомиться на рисунке 4.</w:t>
+      </w:r>
+    </w:p>
+    <w:p>
+      <w:pPr>
+        <w:pStyle w:val="a3"/>
+        <w:spacing w:line="360" w:lineRule="auto"/>
+        <w:ind w:firstLine="709"/>
+        <w:jc w:val="both"/>
+        <w:rPr>
+          <w:rFonts w:ascii="Times New Roman" w:hAnsi="Times New Roman" w:cs="Times New Roman"/>
+          <w:sz w:val="28"/>
+          <w:szCs w:val="32"/>
+        </w:rPr>
+      </w:pPr>
+      <w:r>
+        <w:rPr>
+          <w:rFonts w:ascii="Times New Roman" w:hAnsi="Times New Roman" w:cs="Times New Roman"/>
+          <w:sz w:val="28"/>
+          <w:szCs w:val="32"/>
+        </w:rPr>
+        <w:lastRenderedPageBreak/>
+        <w:t>Диаграммы последовательности в UML применяются для визуализации взаимодействия между объектами системы в рамках выполнения конкретного сценария. В отличие от статических моделей, они позволяют наглядно представить временную последовательность сообщений, передаваемых между компонентами системы.</w:t>
+      </w:r>
+    </w:p>
+    <w:p>
+      <w:pPr>
+        <w:pStyle w:val="a3"/>
+        <w:spacing w:line="360" w:lineRule="auto"/>
+        <w:ind w:firstLine="709"/>
+        <w:jc w:val="both"/>
+        <w:rPr>
+          <w:rFonts w:ascii="Times New Roman" w:hAnsi="Times New Roman" w:cs="Times New Roman"/>
+          <w:sz w:val="28"/>
+          <w:szCs w:val="32"/>
+        </w:rPr>
+      </w:pPr>
+      <w:r>
+        <w:rPr>
+          <w:rFonts w:ascii="Times New Roman" w:hAnsi="Times New Roman" w:cs="Times New Roman"/>
+          <w:sz w:val="28"/>
+          <w:szCs w:val="32"/>
+        </w:rPr>
+        <w:t xml:space="preserve">На разработанной диаграмме отображены следующие ключевые сценарии взаимодействия: </w:t>
+      </w:r>
+      <w:r>
+        <w:rPr>
+          <w:rFonts w:ascii="Times New Roman" w:hAnsi="Times New Roman" w:cs="Times New Roman"/>
+          <w:sz w:val="28"/>
+          <w:szCs w:val="32"/>
+        </w:rPr>
+        <w:t>работник магазина запрашивает детальную информацию о товаре через контроллер «Каталог»</w:t>
+      </w:r>
+      <w:r>
+        <w:rPr>
+          <w:rFonts w:ascii="Times New Roman" w:hAnsi="Times New Roman" w:cs="Times New Roman"/>
+          <w:sz w:val="28"/>
+          <w:szCs w:val="32"/>
+          <w:lang w:val="en-US"/>
+        </w:rPr>
+        <w:t>;</w:t>
+      </w:r>
+      <w:r>
+        <w:rPr>
+          <w:rFonts w:ascii="Times New Roman" w:hAnsi="Times New Roman" w:cs="Times New Roman"/>
+          <w:sz w:val="28"/>
+          <w:szCs w:val="32"/>
+        </w:rPr>
+        <w:t xml:space="preserve"> контроллер «Каталог» обрабатывает запрос и отправляет работнику подробную информацию</w:t>
+      </w:r>
+      <w:r>
+        <w:rPr>
+          <w:rFonts w:ascii="Times New Roman" w:hAnsi="Times New Roman" w:cs="Times New Roman"/>
+          <w:sz w:val="28"/>
+          <w:szCs w:val="32"/>
+        </w:rPr>
+        <w:t xml:space="preserve">; </w:t>
+      </w:r>
+      <w:r>
+        <w:rPr>
+          <w:rFonts w:ascii="Times New Roman" w:hAnsi="Times New Roman" w:cs="Times New Roman"/>
+          <w:sz w:val="28"/>
+          <w:szCs w:val="32"/>
+        </w:rPr>
+        <w:t xml:space="preserve">через контроллер работник отправляет запрос на обновление </w:t>
+      </w:r>
+      <w:proofErr w:type="spellStart"/>
+      <w:r>
+        <w:rPr>
+          <w:rFonts w:ascii="Times New Roman" w:hAnsi="Times New Roman" w:cs="Times New Roman"/>
+          <w:sz w:val="28"/>
+          <w:szCs w:val="32"/>
+        </w:rPr>
+        <w:t>определенных</w:t>
+      </w:r>
+      <w:proofErr w:type="spellEnd"/>
+      <w:r>
+        <w:rPr>
+          <w:rFonts w:ascii="Times New Roman" w:hAnsi="Times New Roman" w:cs="Times New Roman"/>
+          <w:sz w:val="28"/>
+          <w:szCs w:val="32"/>
+        </w:rPr>
+        <w:t xml:space="preserve"> полей продукта</w:t>
+      </w:r>
+      <w:r>
+        <w:rPr>
+          <w:rFonts w:ascii="Times New Roman" w:hAnsi="Times New Roman" w:cs="Times New Roman"/>
+          <w:sz w:val="28"/>
+          <w:szCs w:val="32"/>
+          <w:lang w:val="en-US"/>
+        </w:rPr>
+        <w:t>;</w:t>
+      </w:r>
+      <w:r>
+        <w:rPr>
+          <w:rFonts w:ascii="Times New Roman" w:hAnsi="Times New Roman" w:cs="Times New Roman"/>
+          <w:sz w:val="28"/>
+          <w:szCs w:val="32"/>
+        </w:rPr>
+        <w:t xml:space="preserve"> контроллер обрабатывает запрос, обновляет необходимый продукт и возвращает статус код выполненной операции.</w:t>
+      </w:r>
+    </w:p>
+    <w:p>
+      <w:pPr>
+        <w:pStyle w:val="a3"/>
+        <w:spacing w:line="360" w:lineRule="auto"/>
+        <w:rPr>
+          <w:rFonts w:ascii="Times New Roman" w:hAnsi="Times New Roman" w:cs="Times New Roman"/>
+          <w:sz w:val="28"/>
+          <w:szCs w:val="32"/>
+        </w:rPr>
+      </w:pPr>
+      <w:r>
+        <w:rPr>
+          <w:rFonts w:ascii="Times New Roman" w:hAnsi="Times New Roman" w:cs="Times New Roman"/>
+          <w:sz w:val="28"/>
+          <w:szCs w:val="32"/>
+        </w:rPr>
+        <w:drawing>
+          <wp:inline distT="0" distB="0" distL="0" distR="0" wp14:anchorId="08FF0759" wp14:editId="104CB289">
+            <wp:extent cx="5806440" cy="3738822"/>
+            <wp:effectExtent l="0" t="0" r="3810" b="0"/>
+            <wp:docPr id="8" name="Рисунок 8"/>
+            <wp:cNvGraphicFramePr>
+              <a:graphicFrameLocks xmlns:a="http://schemas.openxmlformats.org/drawingml/2006/main" noChangeAspect="1"/>
+            </wp:cNvGraphicFramePr>
+            <a:graphic xmlns:a="http://schemas.openxmlformats.org/drawingml/2006/main">
+              <a:graphicData uri="http://schemas.openxmlformats.org/drawingml/2006/picture">
+                <pic:pic xmlns:pic="http://schemas.openxmlformats.org/drawingml/2006/picture">
+                  <pic:nvPicPr>
+                    <pic:cNvPr id="1" name=""/>
+                    <pic:cNvPicPr/>
+                  </pic:nvPicPr>
+                  <pic:blipFill>
+                    <a:blip r:embed="rId12"/>
+                    <a:stretch>
+                      <a:fillRect/>
+                    </a:stretch>
+                  </pic:blipFill>
+                  <pic:spPr>
+                    <a:xfrm>
+                      <a:off x="0" y="0"/>
+                      <a:ext cx="5812863" cy="3742958"/>
+                    </a:xfrm>
+                    <a:prstGeom prst="rect">
+                      <a:avLst/>
+                    </a:prstGeom>
+                  </pic:spPr>
+                </pic:pic>
+              </a:graphicData>
+            </a:graphic>
+          </wp:inline>
+        </w:drawing>
+      </w:r>
+    </w:p>
+    <w:p>
+      <w:pPr>
+        <w:pStyle w:val="a3"/>
+        <w:spacing w:line="360" w:lineRule="auto"/>
+        <w:rPr>
+          <w:rFonts w:cs="Times New Roman"/>
+          <w:szCs w:val="32"/>
+        </w:rPr>
+      </w:pPr>
+      <w:r>
+        <w:rPr>
+          <w:rFonts w:ascii="Times New Roman" w:hAnsi="Times New Roman" w:cs="Times New Roman"/>
+          <w:sz w:val="28"/>
+          <w:szCs w:val="32"/>
+        </w:rPr>
+        <w:t>Рисунок 4 – Диаграмма последовательности (</w:t>
+      </w:r>
+      <w:proofErr w:type="spellStart"/>
+      <w:r>
+        <w:rPr>
+          <w:rFonts w:ascii="Times New Roman" w:hAnsi="Times New Roman" w:cs="Times New Roman"/>
+          <w:sz w:val="28"/>
+          <w:szCs w:val="32"/>
+        </w:rPr>
+        <w:t>Sequence</w:t>
+      </w:r>
+      <w:proofErr w:type="spellEnd"/>
+      <w:r>
+        <w:rPr>
+          <w:rFonts w:ascii="Times New Roman" w:hAnsi="Times New Roman" w:cs="Times New Roman"/>
+          <w:sz w:val="28"/>
+          <w:szCs w:val="32"/>
+        </w:rPr>
+        <w:t xml:space="preserve"> </w:t>
+      </w:r>
+      <w:proofErr w:type="spellStart"/>
+      <w:r>
+        <w:rPr>
+          <w:rFonts w:ascii="Times New Roman" w:hAnsi="Times New Roman" w:cs="Times New Roman"/>
+          <w:sz w:val="28"/>
+          <w:szCs w:val="32"/>
+        </w:rPr>
+        <w:t>Diagram</w:t>
+      </w:r>
+      <w:proofErr w:type="spellEnd"/>
+      <w:r>
+        <w:rPr>
+          <w:rFonts w:ascii="Times New Roman" w:hAnsi="Times New Roman" w:cs="Times New Roman"/>
+          <w:sz w:val="28"/>
+          <w:szCs w:val="32"/>
+        </w:rPr>
+        <w:t>).</w:t>
+      </w:r>
+    </w:p>
+    <w:p>
+      <w:pPr>
+        <w:pStyle w:val="a3"/>
+        <w:spacing w:line="360" w:lineRule="auto"/>
+        <w:rPr>
+          <w:rFonts w:ascii="Times New Roman" w:hAnsi="Times New Roman" w:cs="Times New Roman"/>
+          <w:sz w:val="28"/>
+          <w:szCs w:val="32"/>
+        </w:rPr>
+      </w:pPr>
+    </w:p>
+    <w:p>
+      <w:pPr>
+        <w:pStyle w:val="a3"/>
+        <w:spacing w:line="360" w:lineRule="auto"/>
+        <w:ind w:firstLine="709"/>
+        <w:jc w:val="both"/>
+        <w:rPr>
+          <w:rFonts w:cs="Times New Roman"/>
+          <w:b/>
+          <w:bCs/>
+          <w:szCs w:val="28"/>
+        </w:rPr>
+      </w:pPr>
+    </w:p>
+    <w:p>
+      <w:pPr>
+        <w:rPr>
+          <w:rFonts w:cs="Times New Roman"/>
+          <w:szCs w:val="28"/>
+        </w:rPr>
+      </w:pPr>
+    </w:p>
     <w:sectPr>
-      <w:footerReference w:type="default" r:id="rId11"/>
+      <w:footerReference w:type="default" r:id="rId13"/>
       <w:pgSz w:w="11906" w:h="16838"/>
       <w:pgMar w:top="1134" w:right="567" w:bottom="284" w:left="1701" w:header="624" w:footer="170" w:gutter="0"/>
       <w:pgBorders>
@@ -9750,7 +10705,7 @@
   <w:style w:type="paragraph" w:default="1" w:styleId="a">
     <w:name w:val="Normal"/>
     <w:qFormat/>
-    <w:rsid w:val="00967500"/>
+    <w:rsid w:val="002B6197"/>
     <w:rPr>
       <w:rFonts w:ascii="Times New Roman" w:hAnsi="Times New Roman"/>
       <w:sz w:val="28"/>
@@ -9801,7 +10756,6 @@
   <w:style w:type="character" w:default="1" w:styleId="a0">
     <w:name w:val="Default Paragraph Font"/>
     <w:uiPriority w:val="1"/>
-    <w:semiHidden/>
     <w:unhideWhenUsed/>
   </w:style>
   <w:style w:type="table" w:default="1" w:styleId="a1">

</xml_diff>